<commit_message>
feat: generate complete final HUIT standard report with formal front matter and evidence document
</commit_message>
<xml_diff>
--- a/03_Tai_Lieu_Do_An/06_Bao_Cao_Ket_Qua_Do_An/BaoCaoMinhChung_DoAn_DuLieuNoSQL_HoanChinh.docx
+++ b/03_Tai_Lieu_Do_An/06_Bao_Cao_Ket_Qua_Do_An/BaoCaoMinhChung_DoAn_DuLieuNoSQL_HoanChinh.docx
@@ -4,6 +4,8 @@
   <w:body>
     <w:p>
       <w:pPr>
+        <w:spacing w:line="312" w:lineRule="auto"/>
+        <w:ind w:firstLine="0"/>
         <w:rPr>
           <w:rFonts w:ascii="Times New Roman" w:hAnsi="Times New Roman" w:cs="Times New Roman"/>
           <w:sz w:val="26"/>
@@ -13,6 +15,8 @@
     </w:p>
     <w:p>
       <w:pPr>
+        <w:spacing w:line="312" w:lineRule="auto"/>
+        <w:ind w:firstLine="0"/>
         <w:rPr>
           <w:rFonts w:ascii="Times New Roman" w:hAnsi="Times New Roman" w:cs="Times New Roman"/>
           <w:sz w:val="26"/>
@@ -22,6 +26,8 @@
     </w:p>
     <w:p>
       <w:pPr>
+        <w:spacing w:line="312" w:lineRule="auto"/>
+        <w:ind w:firstLine="0"/>
         <w:jc w:val="center"/>
         <w:rPr>
           <w:rFonts w:ascii="Times New Roman" w:hAnsi="Times New Roman" w:cs="Times New Roman"/>
@@ -33,7 +39,7 @@
         <w:rPr>
           <w:rFonts w:ascii="Times New Roman" w:eastAsia="Arial" w:hAnsi="Times New Roman" w:cs="Times New Roman"/>
           <w:b/>
-          <w:color w:val="1F4E79"/>
+          <w:color w:val="000000"/>
           <w:sz w:val="28"/>
           <w:szCs w:val="28"/>
         </w:rPr>
@@ -42,6 +48,8 @@
     </w:p>
     <w:p>
       <w:pPr>
+        <w:spacing w:line="312" w:lineRule="auto"/>
+        <w:ind w:firstLine="0"/>
         <w:jc w:val="center"/>
         <w:rPr>
           <w:rFonts w:ascii="Times New Roman" w:hAnsi="Times New Roman" w:cs="Times New Roman"/>
@@ -53,7 +61,7 @@
         <w:rPr>
           <w:rFonts w:ascii="Times New Roman" w:eastAsia="Arial" w:hAnsi="Times New Roman" w:cs="Times New Roman"/>
           <w:b/>
-          <w:color w:val="1F4E79"/>
+          <w:color w:val="000000"/>
           <w:sz w:val="28"/>
           <w:szCs w:val="28"/>
         </w:rPr>
@@ -62,6 +70,8 @@
     </w:p>
     <w:p>
       <w:pPr>
+        <w:spacing w:line="312" w:lineRule="auto"/>
+        <w:ind w:firstLine="0"/>
         <w:jc w:val="center"/>
         <w:rPr>
           <w:rFonts w:ascii="Times New Roman" w:hAnsi="Times New Roman" w:cs="Times New Roman"/>
@@ -99,66 +109,34 @@
               <w:right w:w="70" w:type="dxa"/>
             </w:tcMar>
             <w:vAlign w:val="center"/>
+            <w:tcMar>
+              <w:top w:w="80" w:type="dxa"/>
+              <w:bottom w:w="80" w:type="dxa"/>
+              <w:left w:w="100" w:type="dxa"/>
+              <w:right w:w="100" w:type="dxa"/>
+            </w:tcMar>
+            <w:tcBorders>
+              <w:top w:val="single" w:sz="4" w:space="0" w:color="000000"/>
+              <w:left w:val="single" w:sz="4" w:space="0" w:color="000000"/>
+              <w:bottom w:val="single" w:sz="4" w:space="0" w:color="000000"/>
+              <w:right w:val="single" w:sz="4" w:space="0" w:color="000000"/>
+            </w:tcBorders>
           </w:tcPr>
           <w:p>
             <w:pPr>
-              <w:rPr>
-                <w:rFonts w:ascii="Times New Roman" w:hAnsi="Times New Roman" w:cs="Times New Roman"/>
-                <w:sz w:val="26"/>
-                <w:szCs w:val="26"/>
-              </w:rPr>
+              <w:spacing w:line="312" w:lineRule="auto" w:before="40" w:after="40"/>
+              <w:ind w:firstLine="0"/>
+              <w:jc w:val="left"/>
             </w:pPr>
-            <w:proofErr w:type="spellStart"/>
             <w:r>
               <w:rPr>
-                <w:rFonts w:ascii="Times New Roman" w:eastAsia="Arial" w:hAnsi="Times New Roman" w:cs="Times New Roman"/>
+                <w:rFonts w:ascii="Times New Roman" w:hAnsi="Times New Roman"/>
                 <w:b/>
-                <w:sz w:val="26"/>
-                <w:szCs w:val="26"/>
+                <w:color w:val="000000"/>
+                <w:sz w:val="24"/>
               </w:rPr>
-              <w:t>Tên</w:t>
+              <w:t>Tên đồ án</w:t>
             </w:r>
-            <w:proofErr w:type="spellEnd"/>
-            <w:r>
-              <w:rPr>
-                <w:rFonts w:ascii="Times New Roman" w:eastAsia="Arial" w:hAnsi="Times New Roman" w:cs="Times New Roman"/>
-                <w:b/>
-                <w:sz w:val="26"/>
-                <w:szCs w:val="26"/>
-              </w:rPr>
-              <w:t xml:space="preserve"> </w:t>
-            </w:r>
-            <w:proofErr w:type="spellStart"/>
-            <w:r>
-              <w:rPr>
-                <w:rFonts w:ascii="Times New Roman" w:eastAsia="Arial" w:hAnsi="Times New Roman" w:cs="Times New Roman"/>
-                <w:b/>
-                <w:sz w:val="26"/>
-                <w:szCs w:val="26"/>
-              </w:rPr>
-              <w:t>đồ</w:t>
-            </w:r>
-            <w:proofErr w:type="spellEnd"/>
-            <w:r>
-              <w:rPr>
-                <w:rFonts w:ascii="Times New Roman" w:eastAsia="Arial" w:hAnsi="Times New Roman" w:cs="Times New Roman"/>
-                <w:b/>
-                <w:sz w:val="26"/>
-                <w:szCs w:val="26"/>
-              </w:rPr>
-              <w:t xml:space="preserve"> </w:t>
-            </w:r>
-            <w:proofErr w:type="spellStart"/>
-            <w:r>
-              <w:rPr>
-                <w:rFonts w:ascii="Times New Roman" w:eastAsia="Arial" w:hAnsi="Times New Roman" w:cs="Times New Roman"/>
-                <w:b/>
-                <w:sz w:val="26"/>
-                <w:szCs w:val="26"/>
-              </w:rPr>
-              <w:t>án</w:t>
-            </w:r>
-            <w:proofErr w:type="spellEnd"/>
           </w:p>
         </w:tc>
         <w:tc>
@@ -172,10 +150,33 @@
               <w:right w:w="70" w:type="dxa"/>
             </w:tcMar>
             <w:vAlign w:val="center"/>
+            <w:tcMar>
+              <w:top w:w="80" w:type="dxa"/>
+              <w:bottom w:w="80" w:type="dxa"/>
+              <w:left w:w="100" w:type="dxa"/>
+              <w:right w:w="100" w:type="dxa"/>
+            </w:tcMar>
+            <w:tcBorders>
+              <w:top w:val="single" w:sz="4" w:space="0" w:color="000000"/>
+              <w:left w:val="single" w:sz="4" w:space="0" w:color="000000"/>
+              <w:bottom w:val="single" w:sz="4" w:space="0" w:color="000000"/>
+              <w:right w:val="single" w:sz="4" w:space="0" w:color="000000"/>
+            </w:tcBorders>
           </w:tcPr>
           <w:p>
+            <w:pPr>
+              <w:spacing w:line="312" w:lineRule="auto" w:before="40" w:after="40"/>
+              <w:ind w:firstLine="0"/>
+              <w:jc w:val="left"/>
+            </w:pPr>
             <w:r>
-              <w:t>Nền tảng E-Learning &amp; Khảo sát năng lực tiếng Anh thực chiến tích hợp 4 CSDL NoSQL (EduPro)</w:t>
+              <w:rPr>
+                <w:rFonts w:ascii="Times New Roman" w:hAnsi="Times New Roman"/>
+                <w:b/>
+                <w:color w:val="000000"/>
+                <w:sz w:val="24"/>
+              </w:rPr>
+              <w:t>Nền tảng E-Learning &amp; Khảo sát năng lực tiếng Anh thực chiến tích hợp đa mô hình NoSQL (EduPro Academy)</w:t>
             </w:r>
           </w:p>
         </w:tc>
@@ -197,47 +198,34 @@
               <w:right w:w="70" w:type="dxa"/>
             </w:tcMar>
             <w:vAlign w:val="center"/>
+            <w:tcMar>
+              <w:top w:w="80" w:type="dxa"/>
+              <w:bottom w:w="80" w:type="dxa"/>
+              <w:left w:w="100" w:type="dxa"/>
+              <w:right w:w="100" w:type="dxa"/>
+            </w:tcMar>
+            <w:tcBorders>
+              <w:top w:val="single" w:sz="4" w:space="0" w:color="000000"/>
+              <w:left w:val="single" w:sz="4" w:space="0" w:color="000000"/>
+              <w:bottom w:val="single" w:sz="4" w:space="0" w:color="000000"/>
+              <w:right w:val="single" w:sz="4" w:space="0" w:color="000000"/>
+            </w:tcBorders>
           </w:tcPr>
           <w:p>
             <w:pPr>
-              <w:rPr>
-                <w:rFonts w:ascii="Times New Roman" w:eastAsia="Arial" w:hAnsi="Times New Roman" w:cs="Times New Roman"/>
-                <w:b/>
-                <w:sz w:val="26"/>
-                <w:szCs w:val="26"/>
-              </w:rPr>
+              <w:spacing w:line="312" w:lineRule="auto" w:before="40" w:after="40"/>
+              <w:ind w:firstLine="0"/>
+              <w:jc w:val="left"/>
             </w:pPr>
-            <w:proofErr w:type="spellStart"/>
             <w:r>
               <w:rPr>
-                <w:rFonts w:ascii="Times New Roman" w:eastAsia="Arial" w:hAnsi="Times New Roman" w:cs="Times New Roman"/>
+                <w:rFonts w:ascii="Times New Roman" w:hAnsi="Times New Roman"/>
                 <w:b/>
-                <w:sz w:val="26"/>
-                <w:szCs w:val="26"/>
+                <w:color w:val="000000"/>
+                <w:sz w:val="24"/>
               </w:rPr>
-              <w:t>Mã</w:t>
+              <w:t>Mã nhóm</w:t>
             </w:r>
-            <w:proofErr w:type="spellEnd"/>
-            <w:r>
-              <w:rPr>
-                <w:rFonts w:ascii="Times New Roman" w:eastAsia="Arial" w:hAnsi="Times New Roman" w:cs="Times New Roman"/>
-                <w:b/>
-                <w:sz w:val="26"/>
-                <w:szCs w:val="26"/>
-              </w:rPr>
-              <w:t xml:space="preserve"> </w:t>
-            </w:r>
-            <w:proofErr w:type="spellStart"/>
-            <w:r>
-              <w:rPr>
-                <w:rFonts w:ascii="Times New Roman" w:eastAsia="Arial" w:hAnsi="Times New Roman" w:cs="Times New Roman"/>
-                <w:b/>
-                <w:sz w:val="26"/>
-                <w:szCs w:val="26"/>
-              </w:rPr>
-              <w:t>nhóm</w:t>
-            </w:r>
-            <w:proofErr w:type="spellEnd"/>
           </w:p>
         </w:tc>
         <w:tc>
@@ -251,9 +239,32 @@
               <w:right w:w="70" w:type="dxa"/>
             </w:tcMar>
             <w:vAlign w:val="center"/>
+            <w:tcMar>
+              <w:top w:w="80" w:type="dxa"/>
+              <w:bottom w:w="80" w:type="dxa"/>
+              <w:left w:w="100" w:type="dxa"/>
+              <w:right w:w="100" w:type="dxa"/>
+            </w:tcMar>
+            <w:tcBorders>
+              <w:top w:val="single" w:sz="4" w:space="0" w:color="000000"/>
+              <w:left w:val="single" w:sz="4" w:space="0" w:color="000000"/>
+              <w:bottom w:val="single" w:sz="4" w:space="0" w:color="000000"/>
+              <w:right w:val="single" w:sz="4" w:space="0" w:color="000000"/>
+            </w:tcBorders>
           </w:tcPr>
           <w:p>
+            <w:pPr>
+              <w:spacing w:line="312" w:lineRule="auto" w:before="40" w:after="40"/>
+              <w:ind w:firstLine="0"/>
+              <w:jc w:val="left"/>
+            </w:pPr>
             <w:r>
+              <w:rPr>
+                <w:rFonts w:ascii="Times New Roman" w:hAnsi="Times New Roman"/>
+                <w:b/>
+                <w:color w:val="000000"/>
+                <w:sz w:val="24"/>
+              </w:rPr>
               <w:t>Nhóm 18 - Lớp 14DHTH</w:t>
             </w:r>
           </w:p>
@@ -276,55 +287,34 @@
               <w:right w:w="70" w:type="dxa"/>
             </w:tcMar>
             <w:vAlign w:val="center"/>
+            <w:tcMar>
+              <w:top w:w="80" w:type="dxa"/>
+              <w:bottom w:w="80" w:type="dxa"/>
+              <w:left w:w="100" w:type="dxa"/>
+              <w:right w:w="100" w:type="dxa"/>
+            </w:tcMar>
+            <w:tcBorders>
+              <w:top w:val="single" w:sz="4" w:space="0" w:color="000000"/>
+              <w:left w:val="single" w:sz="4" w:space="0" w:color="000000"/>
+              <w:bottom w:val="single" w:sz="4" w:space="0" w:color="000000"/>
+              <w:right w:val="single" w:sz="4" w:space="0" w:color="000000"/>
+            </w:tcBorders>
           </w:tcPr>
           <w:p>
             <w:pPr>
-              <w:rPr>
-                <w:rFonts w:ascii="Times New Roman" w:hAnsi="Times New Roman" w:cs="Times New Roman"/>
-                <w:sz w:val="26"/>
-                <w:szCs w:val="26"/>
-              </w:rPr>
+              <w:spacing w:line="312" w:lineRule="auto" w:before="40" w:after="40"/>
+              <w:ind w:firstLine="0"/>
+              <w:jc w:val="left"/>
             </w:pPr>
             <w:r>
               <w:rPr>
-                <w:rFonts w:ascii="Times New Roman" w:eastAsia="Arial" w:hAnsi="Times New Roman" w:cs="Times New Roman"/>
+                <w:rFonts w:ascii="Times New Roman" w:hAnsi="Times New Roman"/>
                 <w:b/>
-                <w:sz w:val="26"/>
-                <w:szCs w:val="26"/>
+                <w:color w:val="000000"/>
+                <w:sz w:val="24"/>
               </w:rPr>
-              <w:t xml:space="preserve">Danh </w:t>
+              <w:t>Danh sách nhóm</w:t>
             </w:r>
-            <w:proofErr w:type="spellStart"/>
-            <w:r>
-              <w:rPr>
-                <w:rFonts w:ascii="Times New Roman" w:eastAsia="Arial" w:hAnsi="Times New Roman" w:cs="Times New Roman"/>
-                <w:b/>
-                <w:sz w:val="26"/>
-                <w:szCs w:val="26"/>
-              </w:rPr>
-              <w:t>sách</w:t>
-            </w:r>
-            <w:proofErr w:type="spellEnd"/>
-            <w:r>
-              <w:rPr>
-                <w:rFonts w:ascii="Times New Roman" w:eastAsia="Arial" w:hAnsi="Times New Roman" w:cs="Times New Roman"/>
-                <w:b/>
-                <w:sz w:val="26"/>
-                <w:szCs w:val="26"/>
-              </w:rPr>
-              <w:t xml:space="preserve"> </w:t>
-            </w:r>
-            <w:proofErr w:type="spellStart"/>
-            <w:r>
-              <w:rPr>
-                <w:rFonts w:ascii="Times New Roman" w:eastAsia="Arial" w:hAnsi="Times New Roman" w:cs="Times New Roman"/>
-                <w:b/>
-                <w:sz w:val="26"/>
-                <w:szCs w:val="26"/>
-              </w:rPr>
-              <w:t>nhóm</w:t>
-            </w:r>
-            <w:proofErr w:type="spellEnd"/>
           </w:p>
         </w:tc>
         <w:tc>
@@ -338,12 +328,37 @@
               <w:right w:w="70" w:type="dxa"/>
             </w:tcMar>
             <w:vAlign w:val="center"/>
+            <w:tcMar>
+              <w:top w:w="80" w:type="dxa"/>
+              <w:bottom w:w="80" w:type="dxa"/>
+              <w:left w:w="100" w:type="dxa"/>
+              <w:right w:w="100" w:type="dxa"/>
+            </w:tcMar>
+            <w:tcBorders>
+              <w:top w:val="single" w:sz="4" w:space="0" w:color="000000"/>
+              <w:left w:val="single" w:sz="4" w:space="0" w:color="000000"/>
+              <w:bottom w:val="single" w:sz="4" w:space="0" w:color="000000"/>
+              <w:right w:val="single" w:sz="4" w:space="0" w:color="000000"/>
+            </w:tcBorders>
           </w:tcPr>
           <w:p>
+            <w:pPr>
+              <w:spacing w:line="312" w:lineRule="auto" w:before="40" w:after="40"/>
+              <w:ind w:firstLine="0"/>
+              <w:jc w:val="left"/>
+            </w:pPr>
             <w:r>
-              <w:t>1. Nguyễn Trọng Nguyên - MSSV: 2001230589 (Nhóm trưởng)</w:t>
+              <w:rPr>
+                <w:rFonts w:ascii="Times New Roman" w:hAnsi="Times New Roman"/>
+                <w:b w:val="0"/>
+                <w:color w:val="000000"/>
+                <w:sz w:val="24"/>
+              </w:rPr>
+              <w:t>1. Nguyễn Trọng Nguyên - MSSV: 2001230589 (Trưởng nhóm)</w:t>
               <w:br/>
-              <w:t>2. Thành viên 2 (Exam, Gamification &amp; CMS)</w:t>
+              <w:t>2. Phạm Nguyễn Khôi Nguyên - MSSV: 2001230578</w:t>
+              <w:br/>
+              <w:t>3. Võ Huỳnh Gia Huy - MSSV: 2001230303</w:t>
             </w:r>
           </w:p>
         </w:tc>
@@ -365,75 +380,34 @@
               <w:right w:w="70" w:type="dxa"/>
             </w:tcMar>
             <w:vAlign w:val="center"/>
+            <w:tcMar>
+              <w:top w:w="80" w:type="dxa"/>
+              <w:bottom w:w="80" w:type="dxa"/>
+              <w:left w:w="100" w:type="dxa"/>
+              <w:right w:w="100" w:type="dxa"/>
+            </w:tcMar>
+            <w:tcBorders>
+              <w:top w:val="single" w:sz="4" w:space="0" w:color="000000"/>
+              <w:left w:val="single" w:sz="4" w:space="0" w:color="000000"/>
+              <w:bottom w:val="single" w:sz="4" w:space="0" w:color="000000"/>
+              <w:right w:val="single" w:sz="4" w:space="0" w:color="000000"/>
+            </w:tcBorders>
           </w:tcPr>
           <w:p>
             <w:pPr>
-              <w:rPr>
-                <w:rFonts w:ascii="Times New Roman" w:hAnsi="Times New Roman" w:cs="Times New Roman"/>
-                <w:sz w:val="26"/>
-                <w:szCs w:val="26"/>
-              </w:rPr>
+              <w:spacing w:line="312" w:lineRule="auto" w:before="40" w:after="40"/>
+              <w:ind w:firstLine="0"/>
+              <w:jc w:val="left"/>
             </w:pPr>
             <w:r>
               <w:rPr>
-                <w:rFonts w:ascii="Times New Roman" w:eastAsia="Arial" w:hAnsi="Times New Roman" w:cs="Times New Roman"/>
+                <w:rFonts w:ascii="Times New Roman" w:hAnsi="Times New Roman"/>
                 <w:b/>
-                <w:sz w:val="26"/>
-                <w:szCs w:val="26"/>
+                <w:color w:val="000000"/>
+                <w:sz w:val="24"/>
               </w:rPr>
-              <w:t xml:space="preserve">Liên </w:t>
+              <w:t>Liên kết mã nguồn</w:t>
             </w:r>
-            <w:proofErr w:type="spellStart"/>
-            <w:r>
-              <w:rPr>
-                <w:rFonts w:ascii="Times New Roman" w:eastAsia="Arial" w:hAnsi="Times New Roman" w:cs="Times New Roman"/>
-                <w:b/>
-                <w:sz w:val="26"/>
-                <w:szCs w:val="26"/>
-              </w:rPr>
-              <w:t>kết</w:t>
-            </w:r>
-            <w:proofErr w:type="spellEnd"/>
-            <w:r>
-              <w:rPr>
-                <w:rFonts w:ascii="Times New Roman" w:eastAsia="Arial" w:hAnsi="Times New Roman" w:cs="Times New Roman"/>
-                <w:b/>
-                <w:sz w:val="26"/>
-                <w:szCs w:val="26"/>
-              </w:rPr>
-              <w:t xml:space="preserve"> </w:t>
-            </w:r>
-            <w:proofErr w:type="spellStart"/>
-            <w:r>
-              <w:rPr>
-                <w:rFonts w:ascii="Times New Roman" w:eastAsia="Arial" w:hAnsi="Times New Roman" w:cs="Times New Roman"/>
-                <w:b/>
-                <w:sz w:val="26"/>
-                <w:szCs w:val="26"/>
-              </w:rPr>
-              <w:t>mã</w:t>
-            </w:r>
-            <w:proofErr w:type="spellEnd"/>
-            <w:r>
-              <w:rPr>
-                <w:rFonts w:ascii="Times New Roman" w:eastAsia="Arial" w:hAnsi="Times New Roman" w:cs="Times New Roman"/>
-                <w:b/>
-                <w:sz w:val="26"/>
-                <w:szCs w:val="26"/>
-              </w:rPr>
-              <w:t xml:space="preserve"> </w:t>
-            </w:r>
-            <w:proofErr w:type="spellStart"/>
-            <w:r>
-              <w:rPr>
-                <w:rFonts w:ascii="Times New Roman" w:eastAsia="Arial" w:hAnsi="Times New Roman" w:cs="Times New Roman"/>
-                <w:b/>
-                <w:sz w:val="26"/>
-                <w:szCs w:val="26"/>
-              </w:rPr>
-              <w:t>nguồn</w:t>
-            </w:r>
-            <w:proofErr w:type="spellEnd"/>
           </w:p>
         </w:tc>
         <w:tc>
@@ -447,9 +421,32 @@
               <w:right w:w="70" w:type="dxa"/>
             </w:tcMar>
             <w:vAlign w:val="center"/>
+            <w:tcMar>
+              <w:top w:w="80" w:type="dxa"/>
+              <w:bottom w:w="80" w:type="dxa"/>
+              <w:left w:w="100" w:type="dxa"/>
+              <w:right w:w="100" w:type="dxa"/>
+            </w:tcMar>
+            <w:tcBorders>
+              <w:top w:val="single" w:sz="4" w:space="0" w:color="000000"/>
+              <w:left w:val="single" w:sz="4" w:space="0" w:color="000000"/>
+              <w:bottom w:val="single" w:sz="4" w:space="0" w:color="000000"/>
+              <w:right w:val="single" w:sz="4" w:space="0" w:color="000000"/>
+            </w:tcBorders>
           </w:tcPr>
           <w:p>
+            <w:pPr>
+              <w:spacing w:line="312" w:lineRule="auto" w:before="40" w:after="40"/>
+              <w:ind w:firstLine="0"/>
+              <w:jc w:val="left"/>
+            </w:pPr>
             <w:r>
+              <w:rPr>
+                <w:rFonts w:ascii="Times New Roman" w:hAnsi="Times New Roman"/>
+                <w:b w:val="0"/>
+                <w:color w:val="000000"/>
+                <w:sz w:val="24"/>
+              </w:rPr>
               <w:t>https://github.com/nguyentrongnguyen3004-eng/DoAn_NoSQL_Elearning.git</w:t>
             </w:r>
           </w:p>
@@ -472,116 +469,34 @@
               <w:right w:w="70" w:type="dxa"/>
             </w:tcMar>
             <w:vAlign w:val="center"/>
+            <w:tcMar>
+              <w:top w:w="80" w:type="dxa"/>
+              <w:bottom w:w="80" w:type="dxa"/>
+              <w:left w:w="100" w:type="dxa"/>
+              <w:right w:w="100" w:type="dxa"/>
+            </w:tcMar>
+            <w:tcBorders>
+              <w:top w:val="single" w:sz="4" w:space="0" w:color="000000"/>
+              <w:left w:val="single" w:sz="4" w:space="0" w:color="000000"/>
+              <w:bottom w:val="single" w:sz="4" w:space="0" w:color="000000"/>
+              <w:right w:val="single" w:sz="4" w:space="0" w:color="000000"/>
+            </w:tcBorders>
           </w:tcPr>
           <w:p>
             <w:pPr>
-              <w:rPr>
-                <w:rFonts w:ascii="Times New Roman" w:eastAsia="Arial" w:hAnsi="Times New Roman" w:cs="Times New Roman"/>
-                <w:b/>
-                <w:sz w:val="26"/>
-                <w:szCs w:val="26"/>
-              </w:rPr>
+              <w:spacing w:line="312" w:lineRule="auto" w:before="40" w:after="40"/>
+              <w:ind w:firstLine="0"/>
+              <w:jc w:val="left"/>
             </w:pPr>
             <w:r>
               <w:rPr>
-                <w:rFonts w:ascii="Times New Roman" w:eastAsia="Arial" w:hAnsi="Times New Roman" w:cs="Times New Roman"/>
+                <w:rFonts w:ascii="Times New Roman" w:hAnsi="Times New Roman"/>
                 <w:b/>
-                <w:sz w:val="26"/>
-                <w:szCs w:val="26"/>
+                <w:color w:val="000000"/>
+                <w:sz w:val="24"/>
               </w:rPr>
-              <w:t xml:space="preserve">Các </w:t>
+              <w:t>Các liên kết trong báo cáo</w:t>
             </w:r>
-            <w:proofErr w:type="spellStart"/>
-            <w:r>
-              <w:rPr>
-                <w:rFonts w:ascii="Times New Roman" w:eastAsia="Arial" w:hAnsi="Times New Roman" w:cs="Times New Roman"/>
-                <w:b/>
-                <w:sz w:val="26"/>
-                <w:szCs w:val="26"/>
-              </w:rPr>
-              <w:t>liên</w:t>
-            </w:r>
-            <w:proofErr w:type="spellEnd"/>
-            <w:r>
-              <w:rPr>
-                <w:rFonts w:ascii="Times New Roman" w:eastAsia="Arial" w:hAnsi="Times New Roman" w:cs="Times New Roman"/>
-                <w:b/>
-                <w:sz w:val="26"/>
-                <w:szCs w:val="26"/>
-              </w:rPr>
-              <w:t xml:space="preserve"> </w:t>
-            </w:r>
-            <w:proofErr w:type="spellStart"/>
-            <w:r>
-              <w:rPr>
-                <w:rFonts w:ascii="Times New Roman" w:eastAsia="Arial" w:hAnsi="Times New Roman" w:cs="Times New Roman"/>
-                <w:b/>
-                <w:sz w:val="26"/>
-                <w:szCs w:val="26"/>
-              </w:rPr>
-              <w:t>kết</w:t>
-            </w:r>
-            <w:proofErr w:type="spellEnd"/>
-            <w:r>
-              <w:rPr>
-                <w:rFonts w:ascii="Times New Roman" w:eastAsia="Arial" w:hAnsi="Times New Roman" w:cs="Times New Roman"/>
-                <w:b/>
-                <w:sz w:val="26"/>
-                <w:szCs w:val="26"/>
-              </w:rPr>
-              <w:t xml:space="preserve"> </w:t>
-            </w:r>
-            <w:proofErr w:type="spellStart"/>
-            <w:r>
-              <w:rPr>
-                <w:rFonts w:ascii="Times New Roman" w:eastAsia="Arial" w:hAnsi="Times New Roman" w:cs="Times New Roman"/>
-                <w:b/>
-                <w:sz w:val="26"/>
-                <w:szCs w:val="26"/>
-              </w:rPr>
-              <w:t>trong</w:t>
-            </w:r>
-            <w:proofErr w:type="spellEnd"/>
-            <w:r>
-              <w:rPr>
-                <w:rFonts w:ascii="Times New Roman" w:eastAsia="Arial" w:hAnsi="Times New Roman" w:cs="Times New Roman"/>
-                <w:b/>
-                <w:sz w:val="26"/>
-                <w:szCs w:val="26"/>
-              </w:rPr>
-              <w:t xml:space="preserve"> </w:t>
-            </w:r>
-            <w:proofErr w:type="spellStart"/>
-            <w:r>
-              <w:rPr>
-                <w:rFonts w:ascii="Times New Roman" w:eastAsia="Arial" w:hAnsi="Times New Roman" w:cs="Times New Roman"/>
-                <w:b/>
-                <w:sz w:val="26"/>
-                <w:szCs w:val="26"/>
-              </w:rPr>
-              <w:t>báo</w:t>
-            </w:r>
-            <w:proofErr w:type="spellEnd"/>
-            <w:r>
-              <w:rPr>
-                <w:rFonts w:ascii="Times New Roman" w:eastAsia="Arial" w:hAnsi="Times New Roman" w:cs="Times New Roman"/>
-                <w:b/>
-                <w:sz w:val="26"/>
-                <w:szCs w:val="26"/>
-              </w:rPr>
-              <w:t xml:space="preserve"> </w:t>
-            </w:r>
-            <w:proofErr w:type="spellStart"/>
-            <w:r>
-              <w:rPr>
-                <w:rFonts w:ascii="Times New Roman" w:eastAsia="Arial" w:hAnsi="Times New Roman" w:cs="Times New Roman"/>
-                <w:b/>
-                <w:sz w:val="26"/>
-                <w:szCs w:val="26"/>
-              </w:rPr>
-              <w:t>cáo</w:t>
-            </w:r>
-            <w:proofErr w:type="spellEnd"/>
           </w:p>
         </w:tc>
         <w:tc>
@@ -595,12 +510,37 @@
               <w:right w:w="70" w:type="dxa"/>
             </w:tcMar>
             <w:vAlign w:val="center"/>
+            <w:tcMar>
+              <w:top w:w="80" w:type="dxa"/>
+              <w:bottom w:w="80" w:type="dxa"/>
+              <w:left w:w="100" w:type="dxa"/>
+              <w:right w:w="100" w:type="dxa"/>
+            </w:tcMar>
+            <w:tcBorders>
+              <w:top w:val="single" w:sz="4" w:space="0" w:color="000000"/>
+              <w:left w:val="single" w:sz="4" w:space="0" w:color="000000"/>
+              <w:bottom w:val="single" w:sz="4" w:space="0" w:color="000000"/>
+              <w:right w:val="single" w:sz="4" w:space="0" w:color="000000"/>
+            </w:tcBorders>
           </w:tcPr>
           <w:p>
+            <w:pPr>
+              <w:spacing w:line="312" w:lineRule="auto" w:before="40" w:after="40"/>
+              <w:ind w:firstLine="0"/>
+              <w:jc w:val="left"/>
+            </w:pPr>
             <w:r>
-              <w:t>• Video Demo: Đính kèm thư mục 07_Video_Demo và link YouTube/Drive</w:t>
+              <w:rPr>
+                <w:rFonts w:ascii="Times New Roman" w:hAnsi="Times New Roman"/>
+                <w:b w:val="0"/>
+                <w:color w:val="000000"/>
+                <w:sz w:val="24"/>
+              </w:rPr>
+              <w:t>• Video Demo: Đính kèm thư mục 07_Video_Demo và link Google Drive</w:t>
               <w:br/>
-              <w:t>• Web LMS: http://localhost:5050</w:t>
+              <w:t>• Giao diện Web LMS: http://localhost:5050</w:t>
+              <w:br/>
+              <w:t>• Bản báo cáo hoàn chỉnh: BAO_CAO_NOSQL_EDUPRO_ACADEMY_FINAL.docx</w:t>
             </w:r>
           </w:p>
         </w:tc>
@@ -608,6 +548,8 @@
     </w:tbl>
     <w:p>
       <w:pPr>
+        <w:spacing w:line="312" w:lineRule="auto"/>
+        <w:ind w:firstLine="0"/>
         <w:rPr>
           <w:rFonts w:ascii="Times New Roman" w:hAnsi="Times New Roman" w:cs="Times New Roman"/>
           <w:sz w:val="26"/>
@@ -617,6 +559,7 @@
       <w:r>
         <w:rPr>
           <w:rFonts w:ascii="Times New Roman" w:hAnsi="Times New Roman" w:cs="Times New Roman"/>
+          <w:color w:val="000000"/>
           <w:sz w:val="26"/>
           <w:szCs w:val="26"/>
         </w:rPr>
@@ -626,7 +569,8 @@
     <w:p>
       <w:pPr>
         <w:pStyle w:val="Heading2"/>
-        <w:spacing w:before="100" w:after="60"/>
+        <w:spacing w:before="100" w:after="60" w:line="312" w:lineRule="auto"/>
+        <w:ind w:firstLine="0"/>
         <w:rPr>
           <w:rFonts w:ascii="Times New Roman" w:hAnsi="Times New Roman" w:cs="Times New Roman"/>
         </w:rPr>
@@ -634,7 +578,7 @@
       <w:r>
         <w:rPr>
           <w:rFonts w:ascii="Times New Roman" w:eastAsia="Arial" w:hAnsi="Times New Roman" w:cs="Times New Roman"/>
-          <w:color w:val="2F5496"/>
+          <w:color w:val="000000"/>
         </w:rPr>
         <w:lastRenderedPageBreak/>
         <w:t>DANH MỤC HỒ SƠ NHÓM PHẢI NỘP</w:t>
@@ -673,22 +617,31 @@
               <w:right w:w="70" w:type="dxa"/>
             </w:tcMar>
             <w:vAlign w:val="center"/>
+            <w:tcMar>
+              <w:top w:w="80" w:type="dxa"/>
+              <w:bottom w:w="80" w:type="dxa"/>
+              <w:left w:w="100" w:type="dxa"/>
+              <w:right w:w="100" w:type="dxa"/>
+            </w:tcMar>
+            <w:tcBorders>
+              <w:top w:val="single" w:sz="4" w:space="0" w:color="000000"/>
+              <w:left w:val="single" w:sz="4" w:space="0" w:color="000000"/>
+              <w:bottom w:val="single" w:sz="4" w:space="0" w:color="000000"/>
+              <w:right w:val="single" w:sz="4" w:space="0" w:color="000000"/>
+            </w:tcBorders>
           </w:tcPr>
           <w:p>
             <w:pPr>
+              <w:spacing w:line="312" w:lineRule="auto" w:before="40" w:after="40"/>
+              <w:ind w:firstLine="0"/>
               <w:jc w:val="center"/>
-              <w:rPr>
-                <w:rFonts w:ascii="Times New Roman" w:hAnsi="Times New Roman" w:cs="Times New Roman"/>
-                <w:sz w:val="26"/>
-                <w:szCs w:val="26"/>
-              </w:rPr>
             </w:pPr>
             <w:r>
               <w:rPr>
-                <w:rFonts w:ascii="Times New Roman" w:eastAsia="Arial" w:hAnsi="Times New Roman" w:cs="Times New Roman"/>
+                <w:rFonts w:ascii="Times New Roman" w:hAnsi="Times New Roman"/>
                 <w:b/>
-                <w:sz w:val="26"/>
-                <w:szCs w:val="26"/>
+                <w:color w:val="000000"/>
+                <w:sz w:val="24"/>
               </w:rPr>
               <w:t>STT</w:t>
             </w:r>
@@ -705,24 +658,33 @@
               <w:right w:w="70" w:type="dxa"/>
             </w:tcMar>
             <w:vAlign w:val="center"/>
+            <w:tcMar>
+              <w:top w:w="80" w:type="dxa"/>
+              <w:bottom w:w="80" w:type="dxa"/>
+              <w:left w:w="100" w:type="dxa"/>
+              <w:right w:w="100" w:type="dxa"/>
+            </w:tcMar>
+            <w:tcBorders>
+              <w:top w:val="single" w:sz="4" w:space="0" w:color="000000"/>
+              <w:left w:val="single" w:sz="4" w:space="0" w:color="000000"/>
+              <w:bottom w:val="single" w:sz="4" w:space="0" w:color="000000"/>
+              <w:right w:val="single" w:sz="4" w:space="0" w:color="000000"/>
+            </w:tcBorders>
           </w:tcPr>
           <w:p>
             <w:pPr>
+              <w:spacing w:line="312" w:lineRule="auto" w:before="40" w:after="40"/>
+              <w:ind w:firstLine="0"/>
               <w:jc w:val="center"/>
-              <w:rPr>
-                <w:rFonts w:ascii="Times New Roman" w:hAnsi="Times New Roman" w:cs="Times New Roman"/>
-                <w:sz w:val="26"/>
-                <w:szCs w:val="26"/>
-              </w:rPr>
             </w:pPr>
             <w:r>
               <w:rPr>
-                <w:rFonts w:ascii="Times New Roman" w:eastAsia="Arial" w:hAnsi="Times New Roman" w:cs="Times New Roman"/>
+                <w:rFonts w:ascii="Times New Roman" w:hAnsi="Times New Roman"/>
                 <w:b/>
-                <w:sz w:val="26"/>
-                <w:szCs w:val="26"/>
+                <w:color w:val="000000"/>
+                <w:sz w:val="24"/>
               </w:rPr>
-              <w:t>Hồ sơ/Sản phẩm</w:t>
+              <w:t>Hồ sơ / Sản phẩm</w:t>
             </w:r>
           </w:p>
         </w:tc>
@@ -737,22 +699,31 @@
               <w:right w:w="70" w:type="dxa"/>
             </w:tcMar>
             <w:vAlign w:val="center"/>
+            <w:tcMar>
+              <w:top w:w="80" w:type="dxa"/>
+              <w:bottom w:w="80" w:type="dxa"/>
+              <w:left w:w="100" w:type="dxa"/>
+              <w:right w:w="100" w:type="dxa"/>
+            </w:tcMar>
+            <w:tcBorders>
+              <w:top w:val="single" w:sz="4" w:space="0" w:color="000000"/>
+              <w:left w:val="single" w:sz="4" w:space="0" w:color="000000"/>
+              <w:bottom w:val="single" w:sz="4" w:space="0" w:color="000000"/>
+              <w:right w:val="single" w:sz="4" w:space="0" w:color="000000"/>
+            </w:tcBorders>
           </w:tcPr>
           <w:p>
             <w:pPr>
+              <w:spacing w:line="312" w:lineRule="auto" w:before="40" w:after="40"/>
+              <w:ind w:firstLine="0"/>
               <w:jc w:val="center"/>
-              <w:rPr>
-                <w:rFonts w:ascii="Times New Roman" w:hAnsi="Times New Roman" w:cs="Times New Roman"/>
-                <w:sz w:val="26"/>
-                <w:szCs w:val="26"/>
-              </w:rPr>
             </w:pPr>
             <w:r>
               <w:rPr>
-                <w:rFonts w:ascii="Times New Roman" w:eastAsia="Arial" w:hAnsi="Times New Roman" w:cs="Times New Roman"/>
+                <w:rFonts w:ascii="Times New Roman" w:hAnsi="Times New Roman"/>
                 <w:b/>
-                <w:sz w:val="26"/>
-                <w:szCs w:val="26"/>
+                <w:color w:val="000000"/>
+                <w:sz w:val="24"/>
               </w:rPr>
               <w:t>Tên tệp hoặc đường dẫn</w:t>
             </w:r>
@@ -769,22 +740,31 @@
               <w:right w:w="70" w:type="dxa"/>
             </w:tcMar>
             <w:vAlign w:val="center"/>
+            <w:tcMar>
+              <w:top w:w="80" w:type="dxa"/>
+              <w:bottom w:w="80" w:type="dxa"/>
+              <w:left w:w="100" w:type="dxa"/>
+              <w:right w:w="100" w:type="dxa"/>
+            </w:tcMar>
+            <w:tcBorders>
+              <w:top w:val="single" w:sz="4" w:space="0" w:color="000000"/>
+              <w:left w:val="single" w:sz="4" w:space="0" w:color="000000"/>
+              <w:bottom w:val="single" w:sz="4" w:space="0" w:color="000000"/>
+              <w:right w:val="single" w:sz="4" w:space="0" w:color="000000"/>
+            </w:tcBorders>
           </w:tcPr>
           <w:p>
             <w:pPr>
+              <w:spacing w:line="312" w:lineRule="auto" w:before="40" w:after="40"/>
+              <w:ind w:firstLine="0"/>
               <w:jc w:val="center"/>
-              <w:rPr>
-                <w:rFonts w:ascii="Times New Roman" w:hAnsi="Times New Roman" w:cs="Times New Roman"/>
-                <w:sz w:val="26"/>
-                <w:szCs w:val="26"/>
-              </w:rPr>
             </w:pPr>
             <w:r>
               <w:rPr>
-                <w:rFonts w:ascii="Times New Roman" w:eastAsia="Arial" w:hAnsi="Times New Roman" w:cs="Times New Roman"/>
+                <w:rFonts w:ascii="Times New Roman" w:hAnsi="Times New Roman"/>
                 <w:b/>
-                <w:sz w:val="26"/>
-                <w:szCs w:val="26"/>
+                <w:color w:val="000000"/>
+                <w:sz w:val="24"/>
               </w:rPr>
               <w:t>Đã nộp</w:t>
             </w:r>
@@ -801,47 +781,34 @@
               <w:right w:w="70" w:type="dxa"/>
             </w:tcMar>
             <w:vAlign w:val="center"/>
+            <w:tcMar>
+              <w:top w:w="80" w:type="dxa"/>
+              <w:bottom w:w="80" w:type="dxa"/>
+              <w:left w:w="100" w:type="dxa"/>
+              <w:right w:w="100" w:type="dxa"/>
+            </w:tcMar>
+            <w:tcBorders>
+              <w:top w:val="single" w:sz="4" w:space="0" w:color="000000"/>
+              <w:left w:val="single" w:sz="4" w:space="0" w:color="000000"/>
+              <w:bottom w:val="single" w:sz="4" w:space="0" w:color="000000"/>
+              <w:right w:val="single" w:sz="4" w:space="0" w:color="000000"/>
+            </w:tcBorders>
           </w:tcPr>
           <w:p>
             <w:pPr>
+              <w:spacing w:line="312" w:lineRule="auto" w:before="40" w:after="40"/>
+              <w:ind w:firstLine="0"/>
               <w:jc w:val="center"/>
-              <w:rPr>
-                <w:rFonts w:ascii="Times New Roman" w:hAnsi="Times New Roman" w:cs="Times New Roman"/>
-                <w:sz w:val="26"/>
-                <w:szCs w:val="26"/>
-              </w:rPr>
             </w:pPr>
-            <w:proofErr w:type="spellStart"/>
             <w:r>
               <w:rPr>
-                <w:rFonts w:ascii="Times New Roman" w:eastAsia="Arial" w:hAnsi="Times New Roman" w:cs="Times New Roman"/>
+                <w:rFonts w:ascii="Times New Roman" w:hAnsi="Times New Roman"/>
                 <w:b/>
-                <w:sz w:val="26"/>
-                <w:szCs w:val="26"/>
+                <w:color w:val="000000"/>
+                <w:sz w:val="24"/>
               </w:rPr>
-              <w:t>Ghi</w:t>
+              <w:t>Ghi chú</w:t>
             </w:r>
-            <w:proofErr w:type="spellEnd"/>
-            <w:r>
-              <w:rPr>
-                <w:rFonts w:ascii="Times New Roman" w:eastAsia="Arial" w:hAnsi="Times New Roman" w:cs="Times New Roman"/>
-                <w:b/>
-                <w:sz w:val="26"/>
-                <w:szCs w:val="26"/>
-              </w:rPr>
-              <w:t xml:space="preserve"> </w:t>
-            </w:r>
-            <w:proofErr w:type="spellStart"/>
-            <w:r>
-              <w:rPr>
-                <w:rFonts w:ascii="Times New Roman" w:eastAsia="Arial" w:hAnsi="Times New Roman" w:cs="Times New Roman"/>
-                <w:b/>
-                <w:sz w:val="26"/>
-                <w:szCs w:val="26"/>
-              </w:rPr>
-              <w:t>chú</w:t>
-            </w:r>
-            <w:proofErr w:type="spellEnd"/>
           </w:p>
         </w:tc>
       </w:tr>
@@ -862,9 +829,32 @@
               <w:right w:w="70" w:type="dxa"/>
             </w:tcMar>
             <w:vAlign w:val="center"/>
+            <w:tcMar>
+              <w:top w:w="80" w:type="dxa"/>
+              <w:bottom w:w="80" w:type="dxa"/>
+              <w:left w:w="100" w:type="dxa"/>
+              <w:right w:w="100" w:type="dxa"/>
+            </w:tcMar>
+            <w:tcBorders>
+              <w:top w:val="single" w:sz="4" w:space="0" w:color="000000"/>
+              <w:left w:val="single" w:sz="4" w:space="0" w:color="000000"/>
+              <w:bottom w:val="single" w:sz="4" w:space="0" w:color="000000"/>
+              <w:right w:val="single" w:sz="4" w:space="0" w:color="000000"/>
+            </w:tcBorders>
           </w:tcPr>
           <w:p>
+            <w:pPr>
+              <w:spacing w:line="312" w:lineRule="auto" w:before="40" w:after="40"/>
+              <w:ind w:firstLine="0"/>
+              <w:jc w:val="center"/>
+            </w:pPr>
             <w:r>
+              <w:rPr>
+                <w:rFonts w:ascii="Times New Roman" w:hAnsi="Times New Roman"/>
+                <w:b w:val="0"/>
+                <w:color w:val="000000"/>
+                <w:sz w:val="24"/>
+              </w:rPr>
               <w:t>1</w:t>
             </w:r>
           </w:p>
@@ -880,9 +870,32 @@
               <w:right w:w="70" w:type="dxa"/>
             </w:tcMar>
             <w:vAlign w:val="center"/>
+            <w:tcMar>
+              <w:top w:w="80" w:type="dxa"/>
+              <w:bottom w:w="80" w:type="dxa"/>
+              <w:left w:w="100" w:type="dxa"/>
+              <w:right w:w="100" w:type="dxa"/>
+            </w:tcMar>
+            <w:tcBorders>
+              <w:top w:val="single" w:sz="4" w:space="0" w:color="000000"/>
+              <w:left w:val="single" w:sz="4" w:space="0" w:color="000000"/>
+              <w:bottom w:val="single" w:sz="4" w:space="0" w:color="000000"/>
+              <w:right w:val="single" w:sz="4" w:space="0" w:color="000000"/>
+            </w:tcBorders>
           </w:tcPr>
           <w:p>
+            <w:pPr>
+              <w:spacing w:line="312" w:lineRule="auto" w:before="40" w:after="40"/>
+              <w:ind w:firstLine="0"/>
+              <w:jc w:val="left"/>
+            </w:pPr>
             <w:r>
+              <w:rPr>
+                <w:rFonts w:ascii="Times New Roman" w:hAnsi="Times New Roman"/>
+                <w:b/>
+                <w:color w:val="000000"/>
+                <w:sz w:val="24"/>
+              </w:rPr>
               <w:t>Source code đầy đủ</w:t>
             </w:r>
           </w:p>
@@ -898,9 +911,32 @@
               <w:right w:w="70" w:type="dxa"/>
             </w:tcMar>
             <w:vAlign w:val="center"/>
+            <w:tcMar>
+              <w:top w:w="80" w:type="dxa"/>
+              <w:bottom w:w="80" w:type="dxa"/>
+              <w:left w:w="100" w:type="dxa"/>
+              <w:right w:w="100" w:type="dxa"/>
+            </w:tcMar>
+            <w:tcBorders>
+              <w:top w:val="single" w:sz="4" w:space="0" w:color="000000"/>
+              <w:left w:val="single" w:sz="4" w:space="0" w:color="000000"/>
+              <w:bottom w:val="single" w:sz="4" w:space="0" w:color="000000"/>
+              <w:right w:val="single" w:sz="4" w:space="0" w:color="000000"/>
+            </w:tcBorders>
           </w:tcPr>
           <w:p>
+            <w:pPr>
+              <w:spacing w:line="312" w:lineRule="auto" w:before="40" w:after="40"/>
+              <w:ind w:firstLine="0"/>
+              <w:jc w:val="left"/>
+            </w:pPr>
             <w:r>
+              <w:rPr>
+                <w:rFonts w:ascii="Times New Roman" w:hAnsi="Times New Roman"/>
+                <w:b w:val="0"/>
+                <w:color w:val="000000"/>
+                <w:sz w:val="22"/>
+              </w:rPr>
               <w:t>01_Source_Code_EduPro/</w:t>
             </w:r>
           </w:p>
@@ -916,9 +952,32 @@
               <w:right w:w="70" w:type="dxa"/>
             </w:tcMar>
             <w:vAlign w:val="center"/>
+            <w:tcMar>
+              <w:top w:w="80" w:type="dxa"/>
+              <w:bottom w:w="80" w:type="dxa"/>
+              <w:left w:w="100" w:type="dxa"/>
+              <w:right w:w="100" w:type="dxa"/>
+            </w:tcMar>
+            <w:tcBorders>
+              <w:top w:val="single" w:sz="4" w:space="0" w:color="000000"/>
+              <w:left w:val="single" w:sz="4" w:space="0" w:color="000000"/>
+              <w:bottom w:val="single" w:sz="4" w:space="0" w:color="000000"/>
+              <w:right w:val="single" w:sz="4" w:space="0" w:color="000000"/>
+            </w:tcBorders>
           </w:tcPr>
           <w:p>
+            <w:pPr>
+              <w:spacing w:line="312" w:lineRule="auto" w:before="40" w:after="40"/>
+              <w:ind w:firstLine="0"/>
+              <w:jc w:val="center"/>
+            </w:pPr>
             <w:r>
+              <w:rPr>
+                <w:rFonts w:ascii="Times New Roman" w:hAnsi="Times New Roman"/>
+                <w:b/>
+                <w:color w:val="000000"/>
+                <w:sz w:val="24"/>
+              </w:rPr>
               <w:t>Đã nộp</w:t>
             </w:r>
           </w:p>
@@ -934,9 +993,32 @@
               <w:right w:w="70" w:type="dxa"/>
             </w:tcMar>
             <w:vAlign w:val="center"/>
+            <w:tcMar>
+              <w:top w:w="80" w:type="dxa"/>
+              <w:bottom w:w="80" w:type="dxa"/>
+              <w:left w:w="100" w:type="dxa"/>
+              <w:right w:w="100" w:type="dxa"/>
+            </w:tcMar>
+            <w:tcBorders>
+              <w:top w:val="single" w:sz="4" w:space="0" w:color="000000"/>
+              <w:left w:val="single" w:sz="4" w:space="0" w:color="000000"/>
+              <w:bottom w:val="single" w:sz="4" w:space="0" w:color="000000"/>
+              <w:right w:val="single" w:sz="4" w:space="0" w:color="000000"/>
+            </w:tcBorders>
           </w:tcPr>
           <w:p>
+            <w:pPr>
+              <w:spacing w:line="312" w:lineRule="auto" w:before="40" w:after="40"/>
+              <w:ind w:firstLine="0"/>
+              <w:jc w:val="left"/>
+            </w:pPr>
             <w:r>
+              <w:rPr>
+                <w:rFonts w:ascii="Times New Roman" w:hAnsi="Times New Roman"/>
+                <w:b w:val="0"/>
+                <w:color w:val="000000"/>
+                <w:sz w:val="22"/>
+              </w:rPr>
               <w:t>Node.js 20+, Express RESTful API, Frontend Vanilla ES6 module hóa tại public/js/</w:t>
             </w:r>
           </w:p>
@@ -959,9 +1041,32 @@
               <w:right w:w="70" w:type="dxa"/>
             </w:tcMar>
             <w:vAlign w:val="center"/>
+            <w:tcMar>
+              <w:top w:w="80" w:type="dxa"/>
+              <w:bottom w:w="80" w:type="dxa"/>
+              <w:left w:w="100" w:type="dxa"/>
+              <w:right w:w="100" w:type="dxa"/>
+            </w:tcMar>
+            <w:tcBorders>
+              <w:top w:val="single" w:sz="4" w:space="0" w:color="000000"/>
+              <w:left w:val="single" w:sz="4" w:space="0" w:color="000000"/>
+              <w:bottom w:val="single" w:sz="4" w:space="0" w:color="000000"/>
+              <w:right w:val="single" w:sz="4" w:space="0" w:color="000000"/>
+            </w:tcBorders>
           </w:tcPr>
           <w:p>
+            <w:pPr>
+              <w:spacing w:line="312" w:lineRule="auto" w:before="40" w:after="40"/>
+              <w:ind w:firstLine="0"/>
+              <w:jc w:val="center"/>
+            </w:pPr>
             <w:r>
+              <w:rPr>
+                <w:rFonts w:ascii="Times New Roman" w:hAnsi="Times New Roman"/>
+                <w:b w:val="0"/>
+                <w:color w:val="000000"/>
+                <w:sz w:val="24"/>
+              </w:rPr>
               <w:t>2</w:t>
             </w:r>
           </w:p>
@@ -977,9 +1082,32 @@
               <w:right w:w="70" w:type="dxa"/>
             </w:tcMar>
             <w:vAlign w:val="center"/>
+            <w:tcMar>
+              <w:top w:w="80" w:type="dxa"/>
+              <w:bottom w:w="80" w:type="dxa"/>
+              <w:left w:w="100" w:type="dxa"/>
+              <w:right w:w="100" w:type="dxa"/>
+            </w:tcMar>
+            <w:tcBorders>
+              <w:top w:val="single" w:sz="4" w:space="0" w:color="000000"/>
+              <w:left w:val="single" w:sz="4" w:space="0" w:color="000000"/>
+              <w:bottom w:val="single" w:sz="4" w:space="0" w:color="000000"/>
+              <w:right w:val="single" w:sz="4" w:space="0" w:color="000000"/>
+            </w:tcBorders>
           </w:tcPr>
           <w:p>
+            <w:pPr>
+              <w:spacing w:line="312" w:lineRule="auto" w:before="40" w:after="40"/>
+              <w:ind w:firstLine="0"/>
+              <w:jc w:val="left"/>
+            </w:pPr>
             <w:r>
+              <w:rPr>
+                <w:rFonts w:ascii="Times New Roman" w:hAnsi="Times New Roman"/>
+                <w:b/>
+                <w:color w:val="000000"/>
+                <w:sz w:val="24"/>
+              </w:rPr>
               <w:t>Script cho từng hệ CSDL NoSQL</w:t>
             </w:r>
           </w:p>
@@ -995,9 +1123,32 @@
               <w:right w:w="70" w:type="dxa"/>
             </w:tcMar>
             <w:vAlign w:val="center"/>
+            <w:tcMar>
+              <w:top w:w="80" w:type="dxa"/>
+              <w:bottom w:w="80" w:type="dxa"/>
+              <w:left w:w="100" w:type="dxa"/>
+              <w:right w:w="100" w:type="dxa"/>
+            </w:tcMar>
+            <w:tcBorders>
+              <w:top w:val="single" w:sz="4" w:space="0" w:color="000000"/>
+              <w:left w:val="single" w:sz="4" w:space="0" w:color="000000"/>
+              <w:bottom w:val="single" w:sz="4" w:space="0" w:color="000000"/>
+              <w:right w:val="single" w:sz="4" w:space="0" w:color="000000"/>
+            </w:tcBorders>
           </w:tcPr>
           <w:p>
+            <w:pPr>
+              <w:spacing w:line="312" w:lineRule="auto" w:before="40" w:after="40"/>
+              <w:ind w:firstLine="0"/>
+              <w:jc w:val="left"/>
+            </w:pPr>
             <w:r>
+              <w:rPr>
+                <w:rFonts w:ascii="Times New Roman" w:hAnsi="Times New Roman"/>
+                <w:b w:val="0"/>
+                <w:color w:val="000000"/>
+                <w:sz w:val="22"/>
+              </w:rPr>
               <w:t>02_Scripts_CSDL_NoSQL/</w:t>
             </w:r>
           </w:p>
@@ -1013,9 +1164,32 @@
               <w:right w:w="70" w:type="dxa"/>
             </w:tcMar>
             <w:vAlign w:val="center"/>
+            <w:tcMar>
+              <w:top w:w="80" w:type="dxa"/>
+              <w:bottom w:w="80" w:type="dxa"/>
+              <w:left w:w="100" w:type="dxa"/>
+              <w:right w:w="100" w:type="dxa"/>
+            </w:tcMar>
+            <w:tcBorders>
+              <w:top w:val="single" w:sz="4" w:space="0" w:color="000000"/>
+              <w:left w:val="single" w:sz="4" w:space="0" w:color="000000"/>
+              <w:bottom w:val="single" w:sz="4" w:space="0" w:color="000000"/>
+              <w:right w:val="single" w:sz="4" w:space="0" w:color="000000"/>
+            </w:tcBorders>
           </w:tcPr>
           <w:p>
+            <w:pPr>
+              <w:spacing w:line="312" w:lineRule="auto" w:before="40" w:after="40"/>
+              <w:ind w:firstLine="0"/>
+              <w:jc w:val="center"/>
+            </w:pPr>
             <w:r>
+              <w:rPr>
+                <w:rFonts w:ascii="Times New Roman" w:hAnsi="Times New Roman"/>
+                <w:b/>
+                <w:color w:val="000000"/>
+                <w:sz w:val="24"/>
+              </w:rPr>
               <w:t>Đã nộp</w:t>
             </w:r>
           </w:p>
@@ -1031,9 +1205,32 @@
               <w:right w:w="70" w:type="dxa"/>
             </w:tcMar>
             <w:vAlign w:val="center"/>
+            <w:tcMar>
+              <w:top w:w="80" w:type="dxa"/>
+              <w:bottom w:w="80" w:type="dxa"/>
+              <w:left w:w="100" w:type="dxa"/>
+              <w:right w:w="100" w:type="dxa"/>
+            </w:tcMar>
+            <w:tcBorders>
+              <w:top w:val="single" w:sz="4" w:space="0" w:color="000000"/>
+              <w:left w:val="single" w:sz="4" w:space="0" w:color="000000"/>
+              <w:bottom w:val="single" w:sz="4" w:space="0" w:color="000000"/>
+              <w:right w:val="single" w:sz="4" w:space="0" w:color="000000"/>
+            </w:tcBorders>
           </w:tcPr>
           <w:p>
+            <w:pPr>
+              <w:spacing w:line="312" w:lineRule="auto" w:before="40" w:after="40"/>
+              <w:ind w:firstLine="0"/>
+              <w:jc w:val="left"/>
+            </w:pPr>
             <w:r>
+              <w:rPr>
+                <w:rFonts w:ascii="Times New Roman" w:hAnsi="Times New Roman"/>
+                <w:b w:val="0"/>
+                <w:color w:val="000000"/>
+                <w:sz w:val="22"/>
+              </w:rPr>
               <w:t>Đầy đủ 4 hệ: mongo_seed.js, redis_demo.js, cassandra_schema.cql, neo4j_graph.cypher</w:t>
             </w:r>
           </w:p>
@@ -1056,9 +1253,32 @@
               <w:right w:w="70" w:type="dxa"/>
             </w:tcMar>
             <w:vAlign w:val="center"/>
+            <w:tcMar>
+              <w:top w:w="80" w:type="dxa"/>
+              <w:bottom w:w="80" w:type="dxa"/>
+              <w:left w:w="100" w:type="dxa"/>
+              <w:right w:w="100" w:type="dxa"/>
+            </w:tcMar>
+            <w:tcBorders>
+              <w:top w:val="single" w:sz="4" w:space="0" w:color="000000"/>
+              <w:left w:val="single" w:sz="4" w:space="0" w:color="000000"/>
+              <w:bottom w:val="single" w:sz="4" w:space="0" w:color="000000"/>
+              <w:right w:val="single" w:sz="4" w:space="0" w:color="000000"/>
+            </w:tcBorders>
           </w:tcPr>
           <w:p>
+            <w:pPr>
+              <w:spacing w:line="312" w:lineRule="auto" w:before="40" w:after="40"/>
+              <w:ind w:firstLine="0"/>
+              <w:jc w:val="center"/>
+            </w:pPr>
             <w:r>
+              <w:rPr>
+                <w:rFonts w:ascii="Times New Roman" w:hAnsi="Times New Roman"/>
+                <w:b w:val="0"/>
+                <w:color w:val="000000"/>
+                <w:sz w:val="24"/>
+              </w:rPr>
               <w:t>3</w:t>
             </w:r>
           </w:p>
@@ -1074,9 +1294,32 @@
               <w:right w:w="70" w:type="dxa"/>
             </w:tcMar>
             <w:vAlign w:val="center"/>
+            <w:tcMar>
+              <w:top w:w="80" w:type="dxa"/>
+              <w:bottom w:w="80" w:type="dxa"/>
+              <w:left w:w="100" w:type="dxa"/>
+              <w:right w:w="100" w:type="dxa"/>
+            </w:tcMar>
+            <w:tcBorders>
+              <w:top w:val="single" w:sz="4" w:space="0" w:color="000000"/>
+              <w:left w:val="single" w:sz="4" w:space="0" w:color="000000"/>
+              <w:bottom w:val="single" w:sz="4" w:space="0" w:color="000000"/>
+              <w:right w:val="single" w:sz="4" w:space="0" w:color="000000"/>
+            </w:tcBorders>
           </w:tcPr>
           <w:p>
+            <w:pPr>
+              <w:spacing w:line="312" w:lineRule="auto" w:before="40" w:after="40"/>
+              <w:ind w:firstLine="0"/>
+              <w:jc w:val="left"/>
+            </w:pPr>
             <w:r>
+              <w:rPr>
+                <w:rFonts w:ascii="Times New Roman" w:hAnsi="Times New Roman"/>
+                <w:b/>
+                <w:color w:val="000000"/>
+                <w:sz w:val="24"/>
+              </w:rPr>
               <w:t>Tài liệu đặc tả yêu cầu phần mềm</w:t>
             </w:r>
           </w:p>
@@ -1092,10 +1335,35 @@
               <w:right w:w="70" w:type="dxa"/>
             </w:tcMar>
             <w:vAlign w:val="center"/>
+            <w:tcMar>
+              <w:top w:w="80" w:type="dxa"/>
+              <w:bottom w:w="80" w:type="dxa"/>
+              <w:left w:w="100" w:type="dxa"/>
+              <w:right w:w="100" w:type="dxa"/>
+            </w:tcMar>
+            <w:tcBorders>
+              <w:top w:val="single" w:sz="4" w:space="0" w:color="000000"/>
+              <w:left w:val="single" w:sz="4" w:space="0" w:color="000000"/>
+              <w:bottom w:val="single" w:sz="4" w:space="0" w:color="000000"/>
+              <w:right w:val="single" w:sz="4" w:space="0" w:color="000000"/>
+            </w:tcBorders>
           </w:tcPr>
           <w:p>
+            <w:pPr>
+              <w:spacing w:line="312" w:lineRule="auto" w:before="40" w:after="40"/>
+              <w:ind w:firstLine="0"/>
+              <w:jc w:val="left"/>
+            </w:pPr>
             <w:r>
-              <w:t>03_Tai_Lieu_Do_An/03_Dac_Ta_Yeu_Cau_SRS/Nhom_18_SRS_Elearning.docx</w:t>
+              <w:rPr>
+                <w:rFonts w:ascii="Times New Roman" w:hAnsi="Times New Roman"/>
+                <w:b w:val="0"/>
+                <w:color w:val="000000"/>
+                <w:sz w:val="22"/>
+              </w:rPr>
+              <w:t>03_Tai_Lieu_Do_An/03_Dac_Ta_Yeu_Cau_SRS/</w:t>
+              <w:br/>
+              <w:t>Nhom_18_SRS_Elearning.docx</w:t>
             </w:r>
           </w:p>
         </w:tc>
@@ -1110,9 +1378,32 @@
               <w:right w:w="70" w:type="dxa"/>
             </w:tcMar>
             <w:vAlign w:val="center"/>
+            <w:tcMar>
+              <w:top w:w="80" w:type="dxa"/>
+              <w:bottom w:w="80" w:type="dxa"/>
+              <w:left w:w="100" w:type="dxa"/>
+              <w:right w:w="100" w:type="dxa"/>
+            </w:tcMar>
+            <w:tcBorders>
+              <w:top w:val="single" w:sz="4" w:space="0" w:color="000000"/>
+              <w:left w:val="single" w:sz="4" w:space="0" w:color="000000"/>
+              <w:bottom w:val="single" w:sz="4" w:space="0" w:color="000000"/>
+              <w:right w:val="single" w:sz="4" w:space="0" w:color="000000"/>
+            </w:tcBorders>
           </w:tcPr>
           <w:p>
+            <w:pPr>
+              <w:spacing w:line="312" w:lineRule="auto" w:before="40" w:after="40"/>
+              <w:ind w:firstLine="0"/>
+              <w:jc w:val="center"/>
+            </w:pPr>
             <w:r>
+              <w:rPr>
+                <w:rFonts w:ascii="Times New Roman" w:hAnsi="Times New Roman"/>
+                <w:b/>
+                <w:color w:val="000000"/>
+                <w:sz w:val="24"/>
+              </w:rPr>
               <w:t>Đã nộp</w:t>
             </w:r>
           </w:p>
@@ -1128,10 +1419,33 @@
               <w:right w:w="70" w:type="dxa"/>
             </w:tcMar>
             <w:vAlign w:val="center"/>
+            <w:tcMar>
+              <w:top w:w="80" w:type="dxa"/>
+              <w:bottom w:w="80" w:type="dxa"/>
+              <w:left w:w="100" w:type="dxa"/>
+              <w:right w:w="100" w:type="dxa"/>
+            </w:tcMar>
+            <w:tcBorders>
+              <w:top w:val="single" w:sz="4" w:space="0" w:color="000000"/>
+              <w:left w:val="single" w:sz="4" w:space="0" w:color="000000"/>
+              <w:bottom w:val="single" w:sz="4" w:space="0" w:color="000000"/>
+              <w:right w:val="single" w:sz="4" w:space="0" w:color="000000"/>
+            </w:tcBorders>
           </w:tcPr>
           <w:p>
+            <w:pPr>
+              <w:spacing w:line="312" w:lineRule="auto" w:before="40" w:after="40"/>
+              <w:ind w:firstLine="0"/>
+              <w:jc w:val="left"/>
+            </w:pPr>
             <w:r>
-              <w:t>Bản đặc tả SRS chuẩn học phần HUIT</w:t>
+              <w:rPr>
+                <w:rFonts w:ascii="Times New Roman" w:hAnsi="Times New Roman"/>
+                <w:b w:val="0"/>
+                <w:color w:val="000000"/>
+                <w:sz w:val="22"/>
+              </w:rPr>
+              <w:t>Đặc tả SRS chuẩn IEEE 830 / ISO 29148 với 15 FRs, 16 APs, 6 NFRs, BPMN, DFD, Sequence</w:t>
             </w:r>
           </w:p>
         </w:tc>
@@ -1153,9 +1467,32 @@
               <w:right w:w="70" w:type="dxa"/>
             </w:tcMar>
             <w:vAlign w:val="center"/>
+            <w:tcMar>
+              <w:top w:w="80" w:type="dxa"/>
+              <w:bottom w:w="80" w:type="dxa"/>
+              <w:left w:w="100" w:type="dxa"/>
+              <w:right w:w="100" w:type="dxa"/>
+            </w:tcMar>
+            <w:tcBorders>
+              <w:top w:val="single" w:sz="4" w:space="0" w:color="000000"/>
+              <w:left w:val="single" w:sz="4" w:space="0" w:color="000000"/>
+              <w:bottom w:val="single" w:sz="4" w:space="0" w:color="000000"/>
+              <w:right w:val="single" w:sz="4" w:space="0" w:color="000000"/>
+            </w:tcBorders>
           </w:tcPr>
           <w:p>
+            <w:pPr>
+              <w:spacing w:line="312" w:lineRule="auto" w:before="40" w:after="40"/>
+              <w:ind w:firstLine="0"/>
+              <w:jc w:val="center"/>
+            </w:pPr>
             <w:r>
+              <w:rPr>
+                <w:rFonts w:ascii="Times New Roman" w:hAnsi="Times New Roman"/>
+                <w:b w:val="0"/>
+                <w:color w:val="000000"/>
+                <w:sz w:val="24"/>
+              </w:rPr>
               <w:t>4</w:t>
             </w:r>
           </w:p>
@@ -1171,9 +1508,32 @@
               <w:right w:w="70" w:type="dxa"/>
             </w:tcMar>
             <w:vAlign w:val="center"/>
+            <w:tcMar>
+              <w:top w:w="80" w:type="dxa"/>
+              <w:bottom w:w="80" w:type="dxa"/>
+              <w:left w:w="100" w:type="dxa"/>
+              <w:right w:w="100" w:type="dxa"/>
+            </w:tcMar>
+            <w:tcBorders>
+              <w:top w:val="single" w:sz="4" w:space="0" w:color="000000"/>
+              <w:left w:val="single" w:sz="4" w:space="0" w:color="000000"/>
+              <w:bottom w:val="single" w:sz="4" w:space="0" w:color="000000"/>
+              <w:right w:val="single" w:sz="4" w:space="0" w:color="000000"/>
+            </w:tcBorders>
           </w:tcPr>
           <w:p>
+            <w:pPr>
+              <w:spacing w:line="312" w:lineRule="auto" w:before="40" w:after="40"/>
+              <w:ind w:firstLine="0"/>
+              <w:jc w:val="left"/>
+            </w:pPr>
             <w:r>
+              <w:rPr>
+                <w:rFonts w:ascii="Times New Roman" w:hAnsi="Times New Roman"/>
+                <w:b/>
+                <w:color w:val="000000"/>
+                <w:sz w:val="24"/>
+              </w:rPr>
               <w:t>Tài liệu đặc tả thiết kế phần mềm</w:t>
             </w:r>
           </w:p>
@@ -1189,10 +1549,35 @@
               <w:right w:w="70" w:type="dxa"/>
             </w:tcMar>
             <w:vAlign w:val="center"/>
+            <w:tcMar>
+              <w:top w:w="80" w:type="dxa"/>
+              <w:bottom w:w="80" w:type="dxa"/>
+              <w:left w:w="100" w:type="dxa"/>
+              <w:right w:w="100" w:type="dxa"/>
+            </w:tcMar>
+            <w:tcBorders>
+              <w:top w:val="single" w:sz="4" w:space="0" w:color="000000"/>
+              <w:left w:val="single" w:sz="4" w:space="0" w:color="000000"/>
+              <w:bottom w:val="single" w:sz="4" w:space="0" w:color="000000"/>
+              <w:right w:val="single" w:sz="4" w:space="0" w:color="000000"/>
+            </w:tcBorders>
           </w:tcPr>
           <w:p>
+            <w:pPr>
+              <w:spacing w:line="312" w:lineRule="auto" w:before="40" w:after="40"/>
+              <w:ind w:firstLine="0"/>
+              <w:jc w:val="left"/>
+            </w:pPr>
             <w:r>
-              <w:t>03_Tai_Lieu_Do_An/04_Dac_Ta_Thiet_Ke_Phan_Mem/Nhom_18_GiaiDoan2_Database_Model.docx</w:t>
+              <w:rPr>
+                <w:rFonts w:ascii="Times New Roman" w:hAnsi="Times New Roman"/>
+                <w:b w:val="0"/>
+                <w:color w:val="000000"/>
+                <w:sz w:val="22"/>
+              </w:rPr>
+              <w:t>03_Tai_Lieu_Do_An/04_Dac_Ta_Thiet_Ke_Phan_Mem/</w:t>
+              <w:br/>
+              <w:t>Nhom_18_GiaiDoan2_Database_Model.docx</w:t>
             </w:r>
           </w:p>
         </w:tc>
@@ -1207,9 +1592,32 @@
               <w:right w:w="70" w:type="dxa"/>
             </w:tcMar>
             <w:vAlign w:val="center"/>
+            <w:tcMar>
+              <w:top w:w="80" w:type="dxa"/>
+              <w:bottom w:w="80" w:type="dxa"/>
+              <w:left w:w="100" w:type="dxa"/>
+              <w:right w:w="100" w:type="dxa"/>
+            </w:tcMar>
+            <w:tcBorders>
+              <w:top w:val="single" w:sz="4" w:space="0" w:color="000000"/>
+              <w:left w:val="single" w:sz="4" w:space="0" w:color="000000"/>
+              <w:bottom w:val="single" w:sz="4" w:space="0" w:color="000000"/>
+              <w:right w:val="single" w:sz="4" w:space="0" w:color="000000"/>
+            </w:tcBorders>
           </w:tcPr>
           <w:p>
+            <w:pPr>
+              <w:spacing w:line="312" w:lineRule="auto" w:before="40" w:after="40"/>
+              <w:ind w:firstLine="0"/>
+              <w:jc w:val="center"/>
+            </w:pPr>
             <w:r>
+              <w:rPr>
+                <w:rFonts w:ascii="Times New Roman" w:hAnsi="Times New Roman"/>
+                <w:b/>
+                <w:color w:val="000000"/>
+                <w:sz w:val="24"/>
+              </w:rPr>
               <w:t>Đã nộp</w:t>
             </w:r>
           </w:p>
@@ -1225,10 +1633,33 @@
               <w:right w:w="70" w:type="dxa"/>
             </w:tcMar>
             <w:vAlign w:val="center"/>
+            <w:tcMar>
+              <w:top w:w="80" w:type="dxa"/>
+              <w:bottom w:w="80" w:type="dxa"/>
+              <w:left w:w="100" w:type="dxa"/>
+              <w:right w:w="100" w:type="dxa"/>
+            </w:tcMar>
+            <w:tcBorders>
+              <w:top w:val="single" w:sz="4" w:space="0" w:color="000000"/>
+              <w:left w:val="single" w:sz="4" w:space="0" w:color="000000"/>
+              <w:bottom w:val="single" w:sz="4" w:space="0" w:color="000000"/>
+              <w:right w:val="single" w:sz="4" w:space="0" w:color="000000"/>
+            </w:tcBorders>
           </w:tcPr>
           <w:p>
+            <w:pPr>
+              <w:spacing w:line="312" w:lineRule="auto" w:before="40" w:after="40"/>
+              <w:ind w:firstLine="0"/>
+              <w:jc w:val="left"/>
+            </w:pPr>
             <w:r>
-              <w:t>Kiến trúc 4 CSDL NoSQL, Schema, ERD và phân công 2 thành viên</w:t>
+              <w:rPr>
+                <w:rFonts w:ascii="Times New Roman" w:hAnsi="Times New Roman"/>
+                <w:b w:val="0"/>
+                <w:color w:val="000000"/>
+                <w:sz w:val="22"/>
+              </w:rPr>
+              <w:t>Đặc tả SDS chuẩn IEEE 1016, thiết kế chi tiết 4 CSDL NoSQL, PACELC, 15 API, Class Diagram</w:t>
             </w:r>
           </w:p>
         </w:tc>
@@ -1250,9 +1681,32 @@
               <w:right w:w="70" w:type="dxa"/>
             </w:tcMar>
             <w:vAlign w:val="center"/>
+            <w:tcMar>
+              <w:top w:w="80" w:type="dxa"/>
+              <w:bottom w:w="80" w:type="dxa"/>
+              <w:left w:w="100" w:type="dxa"/>
+              <w:right w:w="100" w:type="dxa"/>
+            </w:tcMar>
+            <w:tcBorders>
+              <w:top w:val="single" w:sz="4" w:space="0" w:color="000000"/>
+              <w:left w:val="single" w:sz="4" w:space="0" w:color="000000"/>
+              <w:bottom w:val="single" w:sz="4" w:space="0" w:color="000000"/>
+              <w:right w:val="single" w:sz="4" w:space="0" w:color="000000"/>
+            </w:tcBorders>
           </w:tcPr>
           <w:p>
+            <w:pPr>
+              <w:spacing w:line="312" w:lineRule="auto" w:before="40" w:after="40"/>
+              <w:ind w:firstLine="0"/>
+              <w:jc w:val="center"/>
+            </w:pPr>
             <w:r>
+              <w:rPr>
+                <w:rFonts w:ascii="Times New Roman" w:hAnsi="Times New Roman"/>
+                <w:b w:val="0"/>
+                <w:color w:val="000000"/>
+                <w:sz w:val="24"/>
+              </w:rPr>
               <w:t>5</w:t>
             </w:r>
           </w:p>
@@ -1268,9 +1722,32 @@
               <w:right w:w="70" w:type="dxa"/>
             </w:tcMar>
             <w:vAlign w:val="center"/>
+            <w:tcMar>
+              <w:top w:w="80" w:type="dxa"/>
+              <w:bottom w:w="80" w:type="dxa"/>
+              <w:left w:w="100" w:type="dxa"/>
+              <w:right w:w="100" w:type="dxa"/>
+            </w:tcMar>
+            <w:tcBorders>
+              <w:top w:val="single" w:sz="4" w:space="0" w:color="000000"/>
+              <w:left w:val="single" w:sz="4" w:space="0" w:color="000000"/>
+              <w:bottom w:val="single" w:sz="4" w:space="0" w:color="000000"/>
+              <w:right w:val="single" w:sz="4" w:space="0" w:color="000000"/>
+            </w:tcBorders>
           </w:tcPr>
           <w:p>
+            <w:pPr>
+              <w:spacing w:line="312" w:lineRule="auto" w:before="40" w:after="40"/>
+              <w:ind w:firstLine="0"/>
+              <w:jc w:val="left"/>
+            </w:pPr>
             <w:r>
+              <w:rPr>
+                <w:rFonts w:ascii="Times New Roman" w:hAnsi="Times New Roman"/>
+                <w:b/>
+                <w:color w:val="000000"/>
+                <w:sz w:val="24"/>
+              </w:rPr>
               <w:t>Tài liệu/kịch bản kiểm thử</w:t>
             </w:r>
           </w:p>
@@ -1286,10 +1763,35 @@
               <w:right w:w="70" w:type="dxa"/>
             </w:tcMar>
             <w:vAlign w:val="center"/>
+            <w:tcMar>
+              <w:top w:w="80" w:type="dxa"/>
+              <w:bottom w:w="80" w:type="dxa"/>
+              <w:left w:w="100" w:type="dxa"/>
+              <w:right w:w="100" w:type="dxa"/>
+            </w:tcMar>
+            <w:tcBorders>
+              <w:top w:val="single" w:sz="4" w:space="0" w:color="000000"/>
+              <w:left w:val="single" w:sz="4" w:space="0" w:color="000000"/>
+              <w:bottom w:val="single" w:sz="4" w:space="0" w:color="000000"/>
+              <w:right w:val="single" w:sz="4" w:space="0" w:color="000000"/>
+            </w:tcBorders>
           </w:tcPr>
           <w:p>
+            <w:pPr>
+              <w:spacing w:line="312" w:lineRule="auto" w:before="40" w:after="40"/>
+              <w:ind w:firstLine="0"/>
+              <w:jc w:val="left"/>
+            </w:pPr>
             <w:r>
-              <w:t>03_Tai_Lieu_Do_An/05_Tai_Lieu_Kiem_Thu/automated_tests.js</w:t>
+              <w:rPr>
+                <w:rFonts w:ascii="Times New Roman" w:hAnsi="Times New Roman"/>
+                <w:b w:val="0"/>
+                <w:color w:val="000000"/>
+                <w:sz w:val="22"/>
+              </w:rPr>
+              <w:t>03_Tai_Lieu_Do_An/05_Tai_Lieu_Kiem_Thu/</w:t>
+              <w:br/>
+              <w:t>automated_tests.js</w:t>
             </w:r>
           </w:p>
         </w:tc>
@@ -1304,9 +1806,32 @@
               <w:right w:w="70" w:type="dxa"/>
             </w:tcMar>
             <w:vAlign w:val="center"/>
+            <w:tcMar>
+              <w:top w:w="80" w:type="dxa"/>
+              <w:bottom w:w="80" w:type="dxa"/>
+              <w:left w:w="100" w:type="dxa"/>
+              <w:right w:w="100" w:type="dxa"/>
+            </w:tcMar>
+            <w:tcBorders>
+              <w:top w:val="single" w:sz="4" w:space="0" w:color="000000"/>
+              <w:left w:val="single" w:sz="4" w:space="0" w:color="000000"/>
+              <w:bottom w:val="single" w:sz="4" w:space="0" w:color="000000"/>
+              <w:right w:val="single" w:sz="4" w:space="0" w:color="000000"/>
+            </w:tcBorders>
           </w:tcPr>
           <w:p>
+            <w:pPr>
+              <w:spacing w:line="312" w:lineRule="auto" w:before="40" w:after="40"/>
+              <w:ind w:firstLine="0"/>
+              <w:jc w:val="center"/>
+            </w:pPr>
             <w:r>
+              <w:rPr>
+                <w:rFonts w:ascii="Times New Roman" w:hAnsi="Times New Roman"/>
+                <w:b/>
+                <w:color w:val="000000"/>
+                <w:sz w:val="24"/>
+              </w:rPr>
               <w:t>Đã nộp</w:t>
             </w:r>
           </w:p>
@@ -1322,10 +1847,33 @@
               <w:right w:w="70" w:type="dxa"/>
             </w:tcMar>
             <w:vAlign w:val="center"/>
+            <w:tcMar>
+              <w:top w:w="80" w:type="dxa"/>
+              <w:bottom w:w="80" w:type="dxa"/>
+              <w:left w:w="100" w:type="dxa"/>
+              <w:right w:w="100" w:type="dxa"/>
+            </w:tcMar>
+            <w:tcBorders>
+              <w:top w:val="single" w:sz="4" w:space="0" w:color="000000"/>
+              <w:left w:val="single" w:sz="4" w:space="0" w:color="000000"/>
+              <w:bottom w:val="single" w:sz="4" w:space="0" w:color="000000"/>
+              <w:right w:val="single" w:sz="4" w:space="0" w:color="000000"/>
+            </w:tcBorders>
           </w:tcPr>
           <w:p>
+            <w:pPr>
+              <w:spacing w:line="312" w:lineRule="auto" w:before="40" w:after="40"/>
+              <w:ind w:firstLine="0"/>
+              <w:jc w:val="left"/>
+            </w:pPr>
             <w:r>
-              <w:t>22/22 kịch bản Test Case tự động đạt 100% Passed</w:t>
+              <w:rPr>
+                <w:rFonts w:ascii="Times New Roman" w:hAnsi="Times New Roman"/>
+                <w:b w:val="0"/>
+                <w:color w:val="000000"/>
+                <w:sz w:val="22"/>
+              </w:rPr>
+              <w:t>22/22 kịch bản Test Case tự động đạt 100% Passed, k6 load testing, 5 thí nghiệm so sánh</w:t>
             </w:r>
           </w:p>
         </w:tc>
@@ -1347,9 +1895,32 @@
               <w:right w:w="70" w:type="dxa"/>
             </w:tcMar>
             <w:vAlign w:val="center"/>
+            <w:tcMar>
+              <w:top w:w="80" w:type="dxa"/>
+              <w:bottom w:w="80" w:type="dxa"/>
+              <w:left w:w="100" w:type="dxa"/>
+              <w:right w:w="100" w:type="dxa"/>
+            </w:tcMar>
+            <w:tcBorders>
+              <w:top w:val="single" w:sz="4" w:space="0" w:color="000000"/>
+              <w:left w:val="single" w:sz="4" w:space="0" w:color="000000"/>
+              <w:bottom w:val="single" w:sz="4" w:space="0" w:color="000000"/>
+              <w:right w:val="single" w:sz="4" w:space="0" w:color="000000"/>
+            </w:tcBorders>
           </w:tcPr>
           <w:p>
+            <w:pPr>
+              <w:spacing w:line="312" w:lineRule="auto" w:before="40" w:after="40"/>
+              <w:ind w:firstLine="0"/>
+              <w:jc w:val="center"/>
+            </w:pPr>
             <w:r>
+              <w:rPr>
+                <w:rFonts w:ascii="Times New Roman" w:hAnsi="Times New Roman"/>
+                <w:b w:val="0"/>
+                <w:color w:val="000000"/>
+                <w:sz w:val="24"/>
+              </w:rPr>
               <w:t>6</w:t>
             </w:r>
           </w:p>
@@ -1365,9 +1936,32 @@
               <w:right w:w="70" w:type="dxa"/>
             </w:tcMar>
             <w:vAlign w:val="center"/>
+            <w:tcMar>
+              <w:top w:w="80" w:type="dxa"/>
+              <w:bottom w:w="80" w:type="dxa"/>
+              <w:left w:w="100" w:type="dxa"/>
+              <w:right w:w="100" w:type="dxa"/>
+            </w:tcMar>
+            <w:tcBorders>
+              <w:top w:val="single" w:sz="4" w:space="0" w:color="000000"/>
+              <w:left w:val="single" w:sz="4" w:space="0" w:color="000000"/>
+              <w:bottom w:val="single" w:sz="4" w:space="0" w:color="000000"/>
+              <w:right w:val="single" w:sz="4" w:space="0" w:color="000000"/>
+            </w:tcBorders>
           </w:tcPr>
           <w:p>
+            <w:pPr>
+              <w:spacing w:line="312" w:lineRule="auto" w:before="40" w:after="40"/>
+              <w:ind w:firstLine="0"/>
+              <w:jc w:val="left"/>
+            </w:pPr>
             <w:r>
+              <w:rPr>
+                <w:rFonts w:ascii="Times New Roman" w:hAnsi="Times New Roman"/>
+                <w:b/>
+                <w:color w:val="000000"/>
+                <w:sz w:val="24"/>
+              </w:rPr>
               <w:t>Báo cáo kết quả thực hiện đồ án</w:t>
             </w:r>
           </w:p>
@@ -1383,10 +1977,35 @@
               <w:right w:w="70" w:type="dxa"/>
             </w:tcMar>
             <w:vAlign w:val="center"/>
+            <w:tcMar>
+              <w:top w:w="80" w:type="dxa"/>
+              <w:bottom w:w="80" w:type="dxa"/>
+              <w:left w:w="100" w:type="dxa"/>
+              <w:right w:w="100" w:type="dxa"/>
+            </w:tcMar>
+            <w:tcBorders>
+              <w:top w:val="single" w:sz="4" w:space="0" w:color="000000"/>
+              <w:left w:val="single" w:sz="4" w:space="0" w:color="000000"/>
+              <w:bottom w:val="single" w:sz="4" w:space="0" w:color="000000"/>
+              <w:right w:val="single" w:sz="4" w:space="0" w:color="000000"/>
+            </w:tcBorders>
           </w:tcPr>
           <w:p>
+            <w:pPr>
+              <w:spacing w:line="312" w:lineRule="auto" w:before="40" w:after="40"/>
+              <w:ind w:firstLine="0"/>
+              <w:jc w:val="left"/>
+            </w:pPr>
             <w:r>
-              <w:t>03_Tai_Lieu_Do_An/06_Bao_Cao_Ket_Qua_Do_An/BAO_CAO_DO_AN_NOSQL_HUIT.docx</w:t>
+              <w:rPr>
+                <w:rFonts w:ascii="Times New Roman" w:hAnsi="Times New Roman"/>
+                <w:b w:val="0"/>
+                <w:color w:val="000000"/>
+                <w:sz w:val="22"/>
+              </w:rPr>
+              <w:t>TÀI LIỆU FINAL/</w:t>
+              <w:br/>
+              <w:t>BAO_CAO_NOSQL_EDUPRO_ACADEMY_FINAL.docx</w:t>
             </w:r>
           </w:p>
         </w:tc>
@@ -1401,9 +2020,32 @@
               <w:right w:w="70" w:type="dxa"/>
             </w:tcMar>
             <w:vAlign w:val="center"/>
+            <w:tcMar>
+              <w:top w:w="80" w:type="dxa"/>
+              <w:bottom w:w="80" w:type="dxa"/>
+              <w:left w:w="100" w:type="dxa"/>
+              <w:right w:w="100" w:type="dxa"/>
+            </w:tcMar>
+            <w:tcBorders>
+              <w:top w:val="single" w:sz="4" w:space="0" w:color="000000"/>
+              <w:left w:val="single" w:sz="4" w:space="0" w:color="000000"/>
+              <w:bottom w:val="single" w:sz="4" w:space="0" w:color="000000"/>
+              <w:right w:val="single" w:sz="4" w:space="0" w:color="000000"/>
+            </w:tcBorders>
           </w:tcPr>
           <w:p>
+            <w:pPr>
+              <w:spacing w:line="312" w:lineRule="auto" w:before="40" w:after="40"/>
+              <w:ind w:firstLine="0"/>
+              <w:jc w:val="center"/>
+            </w:pPr>
             <w:r>
+              <w:rPr>
+                <w:rFonts w:ascii="Times New Roman" w:hAnsi="Times New Roman"/>
+                <w:b/>
+                <w:color w:val="000000"/>
+                <w:sz w:val="24"/>
+              </w:rPr>
               <w:t>Đã nộp</w:t>
             </w:r>
           </w:p>
@@ -1419,10 +2061,33 @@
               <w:right w:w="70" w:type="dxa"/>
             </w:tcMar>
             <w:vAlign w:val="center"/>
+            <w:tcMar>
+              <w:top w:w="80" w:type="dxa"/>
+              <w:bottom w:w="80" w:type="dxa"/>
+              <w:left w:w="100" w:type="dxa"/>
+              <w:right w:w="100" w:type="dxa"/>
+            </w:tcMar>
+            <w:tcBorders>
+              <w:top w:val="single" w:sz="4" w:space="0" w:color="000000"/>
+              <w:left w:val="single" w:sz="4" w:space="0" w:color="000000"/>
+              <w:bottom w:val="single" w:sz="4" w:space="0" w:color="000000"/>
+              <w:right w:val="single" w:sz="4" w:space="0" w:color="000000"/>
+            </w:tcBorders>
           </w:tcPr>
           <w:p>
+            <w:pPr>
+              <w:spacing w:line="312" w:lineRule="auto" w:before="40" w:after="40"/>
+              <w:ind w:firstLine="0"/>
+              <w:jc w:val="left"/>
+            </w:pPr>
             <w:r>
-              <w:t>Báo cáo tổng kết đồ án NoSQL đầy đủ mục lục, kết luận</w:t>
+              <w:rPr>
+                <w:rFonts w:ascii="Times New Roman" w:hAnsi="Times New Roman"/>
+                <w:b w:val="0"/>
+                <w:color w:val="000000"/>
+                <w:sz w:val="22"/>
+              </w:rPr>
+              <w:t>Báo cáo toàn văn chuẩn HUIT (Bìa, Lời cảm ơn, Nhận xét, Mục lục, Mở đầu, Chương 1-8, TLTK)</w:t>
             </w:r>
           </w:p>
         </w:tc>
@@ -1444,9 +2109,32 @@
               <w:right w:w="70" w:type="dxa"/>
             </w:tcMar>
             <w:vAlign w:val="center"/>
+            <w:tcMar>
+              <w:top w:w="80" w:type="dxa"/>
+              <w:bottom w:w="80" w:type="dxa"/>
+              <w:left w:w="100" w:type="dxa"/>
+              <w:right w:w="100" w:type="dxa"/>
+            </w:tcMar>
+            <w:tcBorders>
+              <w:top w:val="single" w:sz="4" w:space="0" w:color="000000"/>
+              <w:left w:val="single" w:sz="4" w:space="0" w:color="000000"/>
+              <w:bottom w:val="single" w:sz="4" w:space="0" w:color="000000"/>
+              <w:right w:val="single" w:sz="4" w:space="0" w:color="000000"/>
+            </w:tcBorders>
           </w:tcPr>
           <w:p>
+            <w:pPr>
+              <w:spacing w:line="312" w:lineRule="auto" w:before="40" w:after="40"/>
+              <w:ind w:firstLine="0"/>
+              <w:jc w:val="center"/>
+            </w:pPr>
             <w:r>
+              <w:rPr>
+                <w:rFonts w:ascii="Times New Roman" w:hAnsi="Times New Roman"/>
+                <w:b w:val="0"/>
+                <w:color w:val="000000"/>
+                <w:sz w:val="24"/>
+              </w:rPr>
               <w:t>7</w:t>
             </w:r>
           </w:p>
@@ -1462,9 +2150,32 @@
               <w:right w:w="70" w:type="dxa"/>
             </w:tcMar>
             <w:vAlign w:val="center"/>
+            <w:tcMar>
+              <w:top w:w="80" w:type="dxa"/>
+              <w:bottom w:w="80" w:type="dxa"/>
+              <w:left w:w="100" w:type="dxa"/>
+              <w:right w:w="100" w:type="dxa"/>
+            </w:tcMar>
+            <w:tcBorders>
+              <w:top w:val="single" w:sz="4" w:space="0" w:color="000000"/>
+              <w:left w:val="single" w:sz="4" w:space="0" w:color="000000"/>
+              <w:bottom w:val="single" w:sz="4" w:space="0" w:color="000000"/>
+              <w:right w:val="single" w:sz="4" w:space="0" w:color="000000"/>
+            </w:tcBorders>
           </w:tcPr>
           <w:p>
+            <w:pPr>
+              <w:spacing w:line="312" w:lineRule="auto" w:before="40" w:after="40"/>
+              <w:ind w:firstLine="0"/>
+              <w:jc w:val="left"/>
+            </w:pPr>
             <w:r>
+              <w:rPr>
+                <w:rFonts w:ascii="Times New Roman" w:hAnsi="Times New Roman"/>
+                <w:b/>
+                <w:color w:val="000000"/>
+                <w:sz w:val="24"/>
+              </w:rPr>
               <w:t>Video demo các tính năng của sản phẩm</w:t>
             </w:r>
           </w:p>
@@ -1480,9 +2191,32 @@
               <w:right w:w="70" w:type="dxa"/>
             </w:tcMar>
             <w:vAlign w:val="center"/>
+            <w:tcMar>
+              <w:top w:w="80" w:type="dxa"/>
+              <w:bottom w:w="80" w:type="dxa"/>
+              <w:left w:w="100" w:type="dxa"/>
+              <w:right w:w="100" w:type="dxa"/>
+            </w:tcMar>
+            <w:tcBorders>
+              <w:top w:val="single" w:sz="4" w:space="0" w:color="000000"/>
+              <w:left w:val="single" w:sz="4" w:space="0" w:color="000000"/>
+              <w:bottom w:val="single" w:sz="4" w:space="0" w:color="000000"/>
+              <w:right w:val="single" w:sz="4" w:space="0" w:color="000000"/>
+            </w:tcBorders>
           </w:tcPr>
           <w:p>
+            <w:pPr>
+              <w:spacing w:line="312" w:lineRule="auto" w:before="40" w:after="40"/>
+              <w:ind w:firstLine="0"/>
+              <w:jc w:val="left"/>
+            </w:pPr>
             <w:r>
+              <w:rPr>
+                <w:rFonts w:ascii="Times New Roman" w:hAnsi="Times New Roman"/>
+                <w:b w:val="0"/>
+                <w:color w:val="000000"/>
+                <w:sz w:val="22"/>
+              </w:rPr>
               <w:t>07_Video_Demo/LINK_VIDEO_DEMO.txt</w:t>
             </w:r>
           </w:p>
@@ -1498,9 +2232,32 @@
               <w:right w:w="70" w:type="dxa"/>
             </w:tcMar>
             <w:vAlign w:val="center"/>
+            <w:tcMar>
+              <w:top w:w="80" w:type="dxa"/>
+              <w:bottom w:w="80" w:type="dxa"/>
+              <w:left w:w="100" w:type="dxa"/>
+              <w:right w:w="100" w:type="dxa"/>
+            </w:tcMar>
+            <w:tcBorders>
+              <w:top w:val="single" w:sz="4" w:space="0" w:color="000000"/>
+              <w:left w:val="single" w:sz="4" w:space="0" w:color="000000"/>
+              <w:bottom w:val="single" w:sz="4" w:space="0" w:color="000000"/>
+              <w:right w:val="single" w:sz="4" w:space="0" w:color="000000"/>
+            </w:tcBorders>
           </w:tcPr>
           <w:p>
+            <w:pPr>
+              <w:spacing w:line="312" w:lineRule="auto" w:before="40" w:after="40"/>
+              <w:ind w:firstLine="0"/>
+              <w:jc w:val="center"/>
+            </w:pPr>
             <w:r>
+              <w:rPr>
+                <w:rFonts w:ascii="Times New Roman" w:hAnsi="Times New Roman"/>
+                <w:b/>
+                <w:color w:val="000000"/>
+                <w:sz w:val="24"/>
+              </w:rPr>
               <w:t>Đã nộp</w:t>
             </w:r>
           </w:p>
@@ -1516,10 +2273,33 @@
               <w:right w:w="70" w:type="dxa"/>
             </w:tcMar>
             <w:vAlign w:val="center"/>
+            <w:tcMar>
+              <w:top w:w="80" w:type="dxa"/>
+              <w:bottom w:w="80" w:type="dxa"/>
+              <w:left w:w="100" w:type="dxa"/>
+              <w:right w:w="100" w:type="dxa"/>
+            </w:tcMar>
+            <w:tcBorders>
+              <w:top w:val="single" w:sz="4" w:space="0" w:color="000000"/>
+              <w:left w:val="single" w:sz="4" w:space="0" w:color="000000"/>
+              <w:bottom w:val="single" w:sz="4" w:space="0" w:color="000000"/>
+              <w:right w:val="single" w:sz="4" w:space="0" w:color="000000"/>
+            </w:tcBorders>
           </w:tcPr>
           <w:p>
+            <w:pPr>
+              <w:spacing w:line="312" w:lineRule="auto" w:before="40" w:after="40"/>
+              <w:ind w:firstLine="0"/>
+              <w:jc w:val="left"/>
+            </w:pPr>
             <w:r>
-              <w:t>Thời lượng 5-7 phút theo đúng cấu trúc rubric chấm điểm</w:t>
+              <w:rPr>
+                <w:rFonts w:ascii="Times New Roman" w:hAnsi="Times New Roman"/>
+                <w:b w:val="0"/>
+                <w:color w:val="000000"/>
+                <w:sz w:val="22"/>
+              </w:rPr>
+              <w:t>Thời lượng 5-7 phút theo đúng cấu trúc rubric chấm điểm trực tiếp của giảng viên</w:t>
             </w:r>
           </w:p>
         </w:tc>
@@ -1528,7 +2308,8 @@
     <w:p>
       <w:pPr>
         <w:pStyle w:val="Heading1"/>
-        <w:spacing w:before="160" w:after="60"/>
+        <w:spacing w:before="160" w:after="60" w:line="312" w:lineRule="auto"/>
+        <w:ind w:firstLine="0"/>
         <w:rPr>
           <w:rFonts w:ascii="Times New Roman" w:hAnsi="Times New Roman" w:cs="Times New Roman"/>
           <w:sz w:val="26"/>
@@ -1538,7 +2319,7 @@
       <w:r>
         <w:rPr>
           <w:rFonts w:ascii="Times New Roman" w:eastAsia="Arial" w:hAnsi="Times New Roman" w:cs="Times New Roman"/>
-          <w:color w:val="1F4E79"/>
+          <w:color w:val="000000"/>
           <w:sz w:val="26"/>
           <w:szCs w:val="26"/>
         </w:rPr>
@@ -1577,22 +2358,31 @@
               <w:right w:w="70" w:type="dxa"/>
             </w:tcMar>
             <w:vAlign w:val="center"/>
+            <w:tcMar>
+              <w:top w:w="80" w:type="dxa"/>
+              <w:bottom w:w="80" w:type="dxa"/>
+              <w:left w:w="100" w:type="dxa"/>
+              <w:right w:w="100" w:type="dxa"/>
+            </w:tcMar>
+            <w:tcBorders>
+              <w:top w:val="single" w:sz="4" w:space="0" w:color="000000"/>
+              <w:left w:val="single" w:sz="4" w:space="0" w:color="000000"/>
+              <w:bottom w:val="single" w:sz="4" w:space="0" w:color="000000"/>
+              <w:right w:val="single" w:sz="4" w:space="0" w:color="000000"/>
+            </w:tcBorders>
           </w:tcPr>
           <w:p>
             <w:pPr>
+              <w:spacing w:line="312" w:lineRule="auto" w:before="40" w:after="40"/>
+              <w:ind w:firstLine="0"/>
               <w:jc w:val="center"/>
-              <w:rPr>
-                <w:rFonts w:ascii="Times New Roman" w:hAnsi="Times New Roman" w:cs="Times New Roman"/>
-                <w:sz w:val="26"/>
-                <w:szCs w:val="26"/>
-              </w:rPr>
             </w:pPr>
             <w:r>
               <w:rPr>
-                <w:rFonts w:ascii="Times New Roman" w:eastAsia="Arial" w:hAnsi="Times New Roman" w:cs="Times New Roman"/>
+                <w:rFonts w:ascii="Times New Roman" w:hAnsi="Times New Roman"/>
                 <w:b/>
-                <w:sz w:val="26"/>
-                <w:szCs w:val="26"/>
+                <w:color w:val="000000"/>
+                <w:sz w:val="24"/>
               </w:rPr>
               <w:t>STT</w:t>
             </w:r>
@@ -1609,67 +2399,34 @@
               <w:right w:w="70" w:type="dxa"/>
             </w:tcMar>
             <w:vAlign w:val="center"/>
+            <w:tcMar>
+              <w:top w:w="80" w:type="dxa"/>
+              <w:bottom w:w="80" w:type="dxa"/>
+              <w:left w:w="100" w:type="dxa"/>
+              <w:right w:w="100" w:type="dxa"/>
+            </w:tcMar>
+            <w:tcBorders>
+              <w:top w:val="single" w:sz="4" w:space="0" w:color="000000"/>
+              <w:left w:val="single" w:sz="4" w:space="0" w:color="000000"/>
+              <w:bottom w:val="single" w:sz="4" w:space="0" w:color="000000"/>
+              <w:right w:val="single" w:sz="4" w:space="0" w:color="000000"/>
+            </w:tcBorders>
           </w:tcPr>
           <w:p>
             <w:pPr>
+              <w:spacing w:line="312" w:lineRule="auto" w:before="40" w:after="40"/>
+              <w:ind w:firstLine="0"/>
               <w:jc w:val="center"/>
-              <w:rPr>
-                <w:rFonts w:ascii="Times New Roman" w:hAnsi="Times New Roman" w:cs="Times New Roman"/>
-                <w:sz w:val="26"/>
-                <w:szCs w:val="26"/>
-              </w:rPr>
             </w:pPr>
-            <w:proofErr w:type="spellStart"/>
             <w:r>
               <w:rPr>
-                <w:rFonts w:ascii="Times New Roman" w:eastAsia="Arial" w:hAnsi="Times New Roman" w:cs="Times New Roman"/>
+                <w:rFonts w:ascii="Times New Roman" w:hAnsi="Times New Roman"/>
                 <w:b/>
-                <w:sz w:val="26"/>
-                <w:szCs w:val="26"/>
+                <w:color w:val="000000"/>
+                <w:sz w:val="24"/>
               </w:rPr>
-              <w:t>Họ</w:t>
+              <w:t>Họ và tên - MSSV</w:t>
             </w:r>
-            <w:proofErr w:type="spellEnd"/>
-            <w:r>
-              <w:rPr>
-                <w:rFonts w:ascii="Times New Roman" w:eastAsia="Arial" w:hAnsi="Times New Roman" w:cs="Times New Roman"/>
-                <w:b/>
-                <w:sz w:val="26"/>
-                <w:szCs w:val="26"/>
-              </w:rPr>
-              <w:t xml:space="preserve"> </w:t>
-            </w:r>
-            <w:proofErr w:type="spellStart"/>
-            <w:r>
-              <w:rPr>
-                <w:rFonts w:ascii="Times New Roman" w:eastAsia="Arial" w:hAnsi="Times New Roman" w:cs="Times New Roman"/>
-                <w:b/>
-                <w:sz w:val="26"/>
-                <w:szCs w:val="26"/>
-              </w:rPr>
-              <w:t>và</w:t>
-            </w:r>
-            <w:proofErr w:type="spellEnd"/>
-            <w:r>
-              <w:rPr>
-                <w:rFonts w:ascii="Times New Roman" w:eastAsia="Arial" w:hAnsi="Times New Roman" w:cs="Times New Roman"/>
-                <w:b/>
-                <w:sz w:val="26"/>
-                <w:szCs w:val="26"/>
-              </w:rPr>
-              <w:t xml:space="preserve"> </w:t>
-            </w:r>
-            <w:proofErr w:type="spellStart"/>
-            <w:r>
-              <w:rPr>
-                <w:rFonts w:ascii="Times New Roman" w:eastAsia="Arial" w:hAnsi="Times New Roman" w:cs="Times New Roman"/>
-                <w:b/>
-                <w:sz w:val="26"/>
-                <w:szCs w:val="26"/>
-              </w:rPr>
-              <w:t>tên</w:t>
-            </w:r>
-            <w:proofErr w:type="spellEnd"/>
           </w:p>
         </w:tc>
         <w:tc>
@@ -1683,76 +2440,34 @@
               <w:right w:w="70" w:type="dxa"/>
             </w:tcMar>
             <w:vAlign w:val="center"/>
+            <w:tcMar>
+              <w:top w:w="80" w:type="dxa"/>
+              <w:bottom w:w="80" w:type="dxa"/>
+              <w:left w:w="100" w:type="dxa"/>
+              <w:right w:w="100" w:type="dxa"/>
+            </w:tcMar>
+            <w:tcBorders>
+              <w:top w:val="single" w:sz="4" w:space="0" w:color="000000"/>
+              <w:left w:val="single" w:sz="4" w:space="0" w:color="000000"/>
+              <w:bottom w:val="single" w:sz="4" w:space="0" w:color="000000"/>
+              <w:right w:val="single" w:sz="4" w:space="0" w:color="000000"/>
+            </w:tcBorders>
           </w:tcPr>
           <w:p>
             <w:pPr>
+              <w:spacing w:line="312" w:lineRule="auto" w:before="40" w:after="40"/>
+              <w:ind w:firstLine="0"/>
               <w:jc w:val="center"/>
-              <w:rPr>
-                <w:rFonts w:ascii="Times New Roman" w:hAnsi="Times New Roman" w:cs="Times New Roman"/>
-                <w:sz w:val="26"/>
-                <w:szCs w:val="26"/>
-              </w:rPr>
             </w:pPr>
             <w:r>
               <w:rPr>
-                <w:rFonts w:ascii="Times New Roman" w:eastAsia="Arial" w:hAnsi="Times New Roman" w:cs="Times New Roman"/>
+                <w:rFonts w:ascii="Times New Roman" w:hAnsi="Times New Roman"/>
                 <w:b/>
-                <w:sz w:val="26"/>
-                <w:szCs w:val="26"/>
+                <w:color w:val="000000"/>
+                <w:sz w:val="24"/>
               </w:rPr>
-              <w:t xml:space="preserve">Công </w:t>
+              <w:t>Công việc thực hiện</w:t>
             </w:r>
-            <w:proofErr w:type="spellStart"/>
-            <w:r>
-              <w:rPr>
-                <w:rFonts w:ascii="Times New Roman" w:eastAsia="Arial" w:hAnsi="Times New Roman" w:cs="Times New Roman"/>
-                <w:b/>
-                <w:sz w:val="26"/>
-                <w:szCs w:val="26"/>
-              </w:rPr>
-              <w:t>việc</w:t>
-            </w:r>
-            <w:proofErr w:type="spellEnd"/>
-            <w:r>
-              <w:rPr>
-                <w:rFonts w:ascii="Times New Roman" w:eastAsia="Arial" w:hAnsi="Times New Roman" w:cs="Times New Roman"/>
-                <w:b/>
-                <w:sz w:val="26"/>
-                <w:szCs w:val="26"/>
-              </w:rPr>
-              <w:t xml:space="preserve"> </w:t>
-            </w:r>
-            <w:proofErr w:type="spellStart"/>
-            <w:r>
-              <w:rPr>
-                <w:rFonts w:ascii="Times New Roman" w:eastAsia="Arial" w:hAnsi="Times New Roman" w:cs="Times New Roman"/>
-                <w:b/>
-                <w:sz w:val="26"/>
-                <w:szCs w:val="26"/>
-              </w:rPr>
-              <w:t>thực</w:t>
-            </w:r>
-            <w:proofErr w:type="spellEnd"/>
-            <w:r>
-              <w:rPr>
-                <w:rFonts w:ascii="Times New Roman" w:eastAsia="Arial" w:hAnsi="Times New Roman" w:cs="Times New Roman"/>
-                <w:b/>
-                <w:sz w:val="26"/>
-                <w:szCs w:val="26"/>
-              </w:rPr>
-              <w:t xml:space="preserve"> </w:t>
-            </w:r>
-            <w:proofErr w:type="spellStart"/>
-            <w:r>
-              <w:rPr>
-                <w:rFonts w:ascii="Times New Roman" w:eastAsia="Arial" w:hAnsi="Times New Roman" w:cs="Times New Roman"/>
-                <w:b/>
-                <w:sz w:val="26"/>
-                <w:szCs w:val="26"/>
-              </w:rPr>
-              <w:t>hiện</w:t>
-            </w:r>
-            <w:proofErr w:type="spellEnd"/>
           </w:p>
         </w:tc>
         <w:tc>
@@ -1766,135 +2481,33 @@
               <w:right w:w="70" w:type="dxa"/>
             </w:tcMar>
             <w:vAlign w:val="center"/>
+            <w:tcMar>
+              <w:top w:w="80" w:type="dxa"/>
+              <w:bottom w:w="80" w:type="dxa"/>
+              <w:left w:w="100" w:type="dxa"/>
+              <w:right w:w="100" w:type="dxa"/>
+            </w:tcMar>
+            <w:tcBorders>
+              <w:top w:val="single" w:sz="4" w:space="0" w:color="000000"/>
+              <w:left w:val="single" w:sz="4" w:space="0" w:color="000000"/>
+              <w:bottom w:val="single" w:sz="4" w:space="0" w:color="000000"/>
+              <w:right w:val="single" w:sz="4" w:space="0" w:color="000000"/>
+            </w:tcBorders>
           </w:tcPr>
           <w:p>
             <w:pPr>
+              <w:spacing w:line="312" w:lineRule="auto" w:before="40" w:after="40"/>
+              <w:ind w:firstLine="0"/>
               <w:jc w:val="center"/>
-              <w:rPr>
-                <w:rFonts w:ascii="Times New Roman" w:hAnsi="Times New Roman" w:cs="Times New Roman"/>
-                <w:sz w:val="26"/>
-                <w:szCs w:val="26"/>
-              </w:rPr>
             </w:pPr>
-            <w:proofErr w:type="spellStart"/>
             <w:r>
               <w:rPr>
-                <w:rFonts w:ascii="Times New Roman" w:eastAsia="Arial" w:hAnsi="Times New Roman" w:cs="Times New Roman"/>
+                <w:rFonts w:ascii="Times New Roman" w:hAnsi="Times New Roman"/>
                 <w:b/>
-                <w:sz w:val="26"/>
-                <w:szCs w:val="26"/>
+                <w:color w:val="000000"/>
+                <w:sz w:val="24"/>
               </w:rPr>
-              <w:t>Tỷ</w:t>
-            </w:r>
-            <w:proofErr w:type="spellEnd"/>
-            <w:r>
-              <w:rPr>
-                <w:rFonts w:ascii="Times New Roman" w:eastAsia="Arial" w:hAnsi="Times New Roman" w:cs="Times New Roman"/>
-                <w:b/>
-                <w:sz w:val="26"/>
-                <w:szCs w:val="26"/>
-              </w:rPr>
-              <w:t xml:space="preserve"> </w:t>
-            </w:r>
-            <w:proofErr w:type="spellStart"/>
-            <w:r>
-              <w:rPr>
-                <w:rFonts w:ascii="Times New Roman" w:eastAsia="Arial" w:hAnsi="Times New Roman" w:cs="Times New Roman"/>
-                <w:b/>
-                <w:sz w:val="26"/>
-                <w:szCs w:val="26"/>
-              </w:rPr>
-              <w:t>lệ</w:t>
-            </w:r>
-            <w:proofErr w:type="spellEnd"/>
-            <w:r>
-              <w:rPr>
-                <w:rFonts w:ascii="Times New Roman" w:eastAsia="Arial" w:hAnsi="Times New Roman" w:cs="Times New Roman"/>
-                <w:b/>
-                <w:sz w:val="26"/>
-                <w:szCs w:val="26"/>
-              </w:rPr>
-              <w:t xml:space="preserve"> </w:t>
-            </w:r>
-            <w:proofErr w:type="spellStart"/>
-            <w:r>
-              <w:rPr>
-                <w:rFonts w:ascii="Times New Roman" w:eastAsia="Arial" w:hAnsi="Times New Roman" w:cs="Times New Roman"/>
-                <w:b/>
-                <w:sz w:val="26"/>
-                <w:szCs w:val="26"/>
-              </w:rPr>
-              <w:t>đóng</w:t>
-            </w:r>
-            <w:proofErr w:type="spellEnd"/>
-            <w:r>
-              <w:rPr>
-                <w:rFonts w:ascii="Times New Roman" w:eastAsia="Arial" w:hAnsi="Times New Roman" w:cs="Times New Roman"/>
-                <w:b/>
-                <w:sz w:val="26"/>
-                <w:szCs w:val="26"/>
-              </w:rPr>
-              <w:t xml:space="preserve"> </w:t>
-            </w:r>
-            <w:proofErr w:type="spellStart"/>
-            <w:r>
-              <w:rPr>
-                <w:rFonts w:ascii="Times New Roman" w:eastAsia="Arial" w:hAnsi="Times New Roman" w:cs="Times New Roman"/>
-                <w:b/>
-                <w:sz w:val="26"/>
-                <w:szCs w:val="26"/>
-              </w:rPr>
-              <w:t>góp</w:t>
-            </w:r>
-            <w:proofErr w:type="spellEnd"/>
-            <w:r>
-              <w:rPr>
-                <w:rFonts w:ascii="Times New Roman" w:eastAsia="Arial" w:hAnsi="Times New Roman" w:cs="Times New Roman"/>
-                <w:b/>
-                <w:sz w:val="26"/>
-                <w:szCs w:val="26"/>
-              </w:rPr>
-              <w:t xml:space="preserve"> </w:t>
-            </w:r>
-            <w:proofErr w:type="spellStart"/>
-            <w:r>
-              <w:rPr>
-                <w:rFonts w:ascii="Times New Roman" w:eastAsia="Arial" w:hAnsi="Times New Roman" w:cs="Times New Roman"/>
-                <w:b/>
-                <w:sz w:val="26"/>
-                <w:szCs w:val="26"/>
-              </w:rPr>
-              <w:t>dự</w:t>
-            </w:r>
-            <w:proofErr w:type="spellEnd"/>
-            <w:r>
-              <w:rPr>
-                <w:rFonts w:ascii="Times New Roman" w:eastAsia="Arial" w:hAnsi="Times New Roman" w:cs="Times New Roman"/>
-                <w:b/>
-                <w:sz w:val="26"/>
-                <w:szCs w:val="26"/>
-              </w:rPr>
-              <w:t xml:space="preserve"> </w:t>
-            </w:r>
-            <w:proofErr w:type="spellStart"/>
-            <w:r>
-              <w:rPr>
-                <w:rFonts w:ascii="Times New Roman" w:eastAsia="Arial" w:hAnsi="Times New Roman" w:cs="Times New Roman"/>
-                <w:b/>
-                <w:sz w:val="26"/>
-                <w:szCs w:val="26"/>
-              </w:rPr>
-              <w:t>kiến</w:t>
-            </w:r>
-            <w:proofErr w:type="spellEnd"/>
-            <w:r>
-              <w:rPr>
-                <w:rFonts w:ascii="Times New Roman" w:eastAsia="Arial" w:hAnsi="Times New Roman" w:cs="Times New Roman"/>
-                <w:b/>
-                <w:sz w:val="26"/>
-                <w:szCs w:val="26"/>
-              </w:rPr>
-              <w:t xml:space="preserve"> (%)</w:t>
+              <w:t>Tỷ lệ đóng góp dự kiến (%)</w:t>
             </w:r>
           </w:p>
         </w:tc>
@@ -1916,9 +2529,32 @@
               <w:right w:w="70" w:type="dxa"/>
             </w:tcMar>
             <w:vAlign w:val="center"/>
+            <w:tcMar>
+              <w:top w:w="80" w:type="dxa"/>
+              <w:bottom w:w="80" w:type="dxa"/>
+              <w:left w:w="100" w:type="dxa"/>
+              <w:right w:w="100" w:type="dxa"/>
+            </w:tcMar>
+            <w:tcBorders>
+              <w:top w:val="single" w:sz="4" w:space="0" w:color="000000"/>
+              <w:left w:val="single" w:sz="4" w:space="0" w:color="000000"/>
+              <w:bottom w:val="single" w:sz="4" w:space="0" w:color="000000"/>
+              <w:right w:val="single" w:sz="4" w:space="0" w:color="000000"/>
+            </w:tcBorders>
           </w:tcPr>
           <w:p>
+            <w:pPr>
+              <w:spacing w:line="312" w:lineRule="auto" w:before="40" w:after="40"/>
+              <w:ind w:firstLine="0"/>
+              <w:jc w:val="center"/>
+            </w:pPr>
             <w:r>
+              <w:rPr>
+                <w:rFonts w:ascii="Times New Roman" w:hAnsi="Times New Roman"/>
+                <w:b w:val="0"/>
+                <w:color w:val="000000"/>
+                <w:sz w:val="24"/>
+              </w:rPr>
               <w:t>1</w:t>
             </w:r>
           </w:p>
@@ -1934,10 +2570,37 @@
               <w:right w:w="70" w:type="dxa"/>
             </w:tcMar>
             <w:vAlign w:val="center"/>
+            <w:tcMar>
+              <w:top w:w="80" w:type="dxa"/>
+              <w:bottom w:w="80" w:type="dxa"/>
+              <w:left w:w="100" w:type="dxa"/>
+              <w:right w:w="100" w:type="dxa"/>
+            </w:tcMar>
+            <w:tcBorders>
+              <w:top w:val="single" w:sz="4" w:space="0" w:color="000000"/>
+              <w:left w:val="single" w:sz="4" w:space="0" w:color="000000"/>
+              <w:bottom w:val="single" w:sz="4" w:space="0" w:color="000000"/>
+              <w:right w:val="single" w:sz="4" w:space="0" w:color="000000"/>
+            </w:tcBorders>
           </w:tcPr>
           <w:p>
+            <w:pPr>
+              <w:spacing w:line="312" w:lineRule="auto" w:before="40" w:after="40"/>
+              <w:ind w:firstLine="0"/>
+              <w:jc w:val="left"/>
+            </w:pPr>
             <w:r>
-              <w:t>Nguyễn Trọng Nguyên (2001230589)</w:t>
+              <w:rPr>
+                <w:rFonts w:ascii="Times New Roman" w:hAnsi="Times New Roman"/>
+                <w:b/>
+                <w:color w:val="000000"/>
+                <w:sz w:val="24"/>
+              </w:rPr>
+              <w:t>Nguyễn Trọng Nguyên</w:t>
+              <w:br/>
+              <w:t>MSSV: 2001230589</w:t>
+              <w:br/>
+              <w:t>(Trưởng nhóm)</w:t>
             </w:r>
           </w:p>
         </w:tc>
@@ -1952,10 +2615,33 @@
               <w:right w:w="70" w:type="dxa"/>
             </w:tcMar>
             <w:vAlign w:val="center"/>
+            <w:tcMar>
+              <w:top w:w="80" w:type="dxa"/>
+              <w:bottom w:w="80" w:type="dxa"/>
+              <w:left w:w="100" w:type="dxa"/>
+              <w:right w:w="100" w:type="dxa"/>
+            </w:tcMar>
+            <w:tcBorders>
+              <w:top w:val="single" w:sz="4" w:space="0" w:color="000000"/>
+              <w:left w:val="single" w:sz="4" w:space="0" w:color="000000"/>
+              <w:bottom w:val="single" w:sz="4" w:space="0" w:color="000000"/>
+              <w:right w:val="single" w:sz="4" w:space="0" w:color="000000"/>
+            </w:tcBorders>
           </w:tcPr>
           <w:p>
+            <w:pPr>
+              <w:spacing w:line="312" w:lineRule="auto" w:before="40" w:after="40"/>
+              <w:ind w:firstLine="0"/>
+              <w:jc w:val="left"/>
+            </w:pPr>
             <w:r>
-              <w:t>Nhóm trưởng, thiết kế kiến trúc 4 CSDL NoSQL, module Academic &amp; LMS (Khóa học, Từ vựng cá nhân, Chế độ rảnh tay, AI Writing Lab, bộ kiểm thử 22 Test Cases, Reorganization &amp; Deployment)</w:t>
+              <w:rPr>
+                <w:rFonts w:ascii="Times New Roman" w:hAnsi="Times New Roman"/>
+                <w:b w:val="0"/>
+                <w:color w:val="000000"/>
+                <w:sz w:val="22"/>
+              </w:rPr>
+              <w:t>Nhóm trưởng, thiết kế kiến trúc tổng thể Polyglot NoSQL, cấu hình MongoDB Core Store &amp; Redis Cache, xây dựng phân hệ Quản lý đào tạo LMS (Khóa học, Bài học video, Từ vựng Flashcard, Sổ tay thông minh), xây dựng bộ kiểm thử tự động 22 Test Cases, biên soạn Chương 1, 2, 4, 7 và tổng hợp báo cáo.</w:t>
             </w:r>
           </w:p>
         </w:tc>
@@ -1970,10 +2656,33 @@
               <w:right w:w="70" w:type="dxa"/>
             </w:tcMar>
             <w:vAlign w:val="center"/>
+            <w:tcMar>
+              <w:top w:w="80" w:type="dxa"/>
+              <w:bottom w:w="80" w:type="dxa"/>
+              <w:left w:w="100" w:type="dxa"/>
+              <w:right w:w="100" w:type="dxa"/>
+            </w:tcMar>
+            <w:tcBorders>
+              <w:top w:val="single" w:sz="4" w:space="0" w:color="000000"/>
+              <w:left w:val="single" w:sz="4" w:space="0" w:color="000000"/>
+              <w:bottom w:val="single" w:sz="4" w:space="0" w:color="000000"/>
+              <w:right w:val="single" w:sz="4" w:space="0" w:color="000000"/>
+            </w:tcBorders>
           </w:tcPr>
           <w:p>
+            <w:pPr>
+              <w:spacing w:line="312" w:lineRule="auto" w:before="40" w:after="40"/>
+              <w:ind w:firstLine="0"/>
+              <w:jc w:val="center"/>
+            </w:pPr>
             <w:r>
-              <w:t>50%</w:t>
+              <w:rPr>
+                <w:rFonts w:ascii="Times New Roman" w:hAnsi="Times New Roman"/>
+                <w:b/>
+                <w:color w:val="000000"/>
+                <w:sz w:val="24"/>
+              </w:rPr>
+              <w:t>40%</w:t>
             </w:r>
           </w:p>
         </w:tc>
@@ -1995,9 +2704,32 @@
               <w:right w:w="70" w:type="dxa"/>
             </w:tcMar>
             <w:vAlign w:val="center"/>
+            <w:tcMar>
+              <w:top w:w="80" w:type="dxa"/>
+              <w:bottom w:w="80" w:type="dxa"/>
+              <w:left w:w="100" w:type="dxa"/>
+              <w:right w:w="100" w:type="dxa"/>
+            </w:tcMar>
+            <w:tcBorders>
+              <w:top w:val="single" w:sz="4" w:space="0" w:color="000000"/>
+              <w:left w:val="single" w:sz="4" w:space="0" w:color="000000"/>
+              <w:bottom w:val="single" w:sz="4" w:space="0" w:color="000000"/>
+              <w:right w:val="single" w:sz="4" w:space="0" w:color="000000"/>
+            </w:tcBorders>
           </w:tcPr>
           <w:p>
+            <w:pPr>
+              <w:spacing w:line="312" w:lineRule="auto" w:before="40" w:after="40"/>
+              <w:ind w:firstLine="0"/>
+              <w:jc w:val="center"/>
+            </w:pPr>
             <w:r>
+              <w:rPr>
+                <w:rFonts w:ascii="Times New Roman" w:hAnsi="Times New Roman"/>
+                <w:b w:val="0"/>
+                <w:color w:val="000000"/>
+                <w:sz w:val="24"/>
+              </w:rPr>
               <w:t>2</w:t>
             </w:r>
           </w:p>
@@ -2013,10 +2745,35 @@
               <w:right w:w="70" w:type="dxa"/>
             </w:tcMar>
             <w:vAlign w:val="center"/>
+            <w:tcMar>
+              <w:top w:w="80" w:type="dxa"/>
+              <w:bottom w:w="80" w:type="dxa"/>
+              <w:left w:w="100" w:type="dxa"/>
+              <w:right w:w="100" w:type="dxa"/>
+            </w:tcMar>
+            <w:tcBorders>
+              <w:top w:val="single" w:sz="4" w:space="0" w:color="000000"/>
+              <w:left w:val="single" w:sz="4" w:space="0" w:color="000000"/>
+              <w:bottom w:val="single" w:sz="4" w:space="0" w:color="000000"/>
+              <w:right w:val="single" w:sz="4" w:space="0" w:color="000000"/>
+            </w:tcBorders>
           </w:tcPr>
           <w:p>
+            <w:pPr>
+              <w:spacing w:line="312" w:lineRule="auto" w:before="40" w:after="40"/>
+              <w:ind w:firstLine="0"/>
+              <w:jc w:val="left"/>
+            </w:pPr>
             <w:r>
-              <w:t>Thành viên 2</w:t>
+              <w:rPr>
+                <w:rFonts w:ascii="Times New Roman" w:hAnsi="Times New Roman"/>
+                <w:b/>
+                <w:color w:val="000000"/>
+                <w:sz w:val="24"/>
+              </w:rPr>
+              <w:t>Phạm Nguyễn Khôi Nguyên</w:t>
+              <w:br/>
+              <w:t>MSSV: 2001230578</w:t>
             </w:r>
           </w:p>
         </w:tc>
@@ -2031,10 +2788,33 @@
               <w:right w:w="70" w:type="dxa"/>
             </w:tcMar>
             <w:vAlign w:val="center"/>
+            <w:tcMar>
+              <w:top w:w="80" w:type="dxa"/>
+              <w:bottom w:w="80" w:type="dxa"/>
+              <w:left w:w="100" w:type="dxa"/>
+              <w:right w:w="100" w:type="dxa"/>
+            </w:tcMar>
+            <w:tcBorders>
+              <w:top w:val="single" w:sz="4" w:space="0" w:color="000000"/>
+              <w:left w:val="single" w:sz="4" w:space="0" w:color="000000"/>
+              <w:bottom w:val="single" w:sz="4" w:space="0" w:color="000000"/>
+              <w:right w:val="single" w:sz="4" w:space="0" w:color="000000"/>
+            </w:tcBorders>
           </w:tcPr>
           <w:p>
+            <w:pPr>
+              <w:spacing w:line="312" w:lineRule="auto" w:before="40" w:after="40"/>
+              <w:ind w:firstLine="0"/>
+              <w:jc w:val="left"/>
+            </w:pPr>
             <w:r>
-              <w:t>Module Exam, Gamification &amp; CMS (Phòng thi &amp; Anti-cheat 3/3, Cửa hàng đổi quà XP, Vòng đời CMS, Xác thực chứng chỉ)</w:t>
+              <w:rPr>
+                <w:rFonts w:ascii="Times New Roman" w:hAnsi="Times New Roman"/>
+                <w:b w:val="0"/>
+                <w:color w:val="000000"/>
+                <w:sz w:val="22"/>
+              </w:rPr>
+              <w:t>Thiết kế Keyspace và bảng Column-family trên Apache Cassandra, xây dựng hệ thống theo dõi tiến độ học tập chuỗi thời gian (Time-series Learning Events, Heartbeat 5s), triển khai phòng thi trắc nghiệm trực tuyến thời gian thực và thuật toán chống gian lận Anti-cheat 3/3 cảnh báo, đo lường kiểm thử tải k6, biên soạn Chương 3, 5.</w:t>
             </w:r>
           </w:p>
         </w:tc>
@@ -2049,10 +2829,33 @@
               <w:right w:w="70" w:type="dxa"/>
             </w:tcMar>
             <w:vAlign w:val="center"/>
+            <w:tcMar>
+              <w:top w:w="80" w:type="dxa"/>
+              <w:bottom w:w="80" w:type="dxa"/>
+              <w:left w:w="100" w:type="dxa"/>
+              <w:right w:w="100" w:type="dxa"/>
+            </w:tcMar>
+            <w:tcBorders>
+              <w:top w:val="single" w:sz="4" w:space="0" w:color="000000"/>
+              <w:left w:val="single" w:sz="4" w:space="0" w:color="000000"/>
+              <w:bottom w:val="single" w:sz="4" w:space="0" w:color="000000"/>
+              <w:right w:val="single" w:sz="4" w:space="0" w:color="000000"/>
+            </w:tcBorders>
           </w:tcPr>
           <w:p>
+            <w:pPr>
+              <w:spacing w:line="312" w:lineRule="auto" w:before="40" w:after="40"/>
+              <w:ind w:firstLine="0"/>
+              <w:jc w:val="center"/>
+            </w:pPr>
             <w:r>
-              <w:t>50%</w:t>
+              <w:rPr>
+                <w:rFonts w:ascii="Times New Roman" w:hAnsi="Times New Roman"/>
+                <w:b/>
+                <w:color w:val="000000"/>
+                <w:sz w:val="24"/>
+              </w:rPr>
+              <w:t>30%</w:t>
             </w:r>
           </w:p>
         </w:tc>
@@ -2074,10 +2877,33 @@
               <w:right w:w="70" w:type="dxa"/>
             </w:tcMar>
             <w:vAlign w:val="center"/>
+            <w:tcMar>
+              <w:top w:w="80" w:type="dxa"/>
+              <w:bottom w:w="80" w:type="dxa"/>
+              <w:left w:w="100" w:type="dxa"/>
+              <w:right w:w="100" w:type="dxa"/>
+            </w:tcMar>
+            <w:tcBorders>
+              <w:top w:val="single" w:sz="4" w:space="0" w:color="000000"/>
+              <w:left w:val="single" w:sz="4" w:space="0" w:color="000000"/>
+              <w:bottom w:val="single" w:sz="4" w:space="0" w:color="000000"/>
+              <w:right w:val="single" w:sz="4" w:space="0" w:color="000000"/>
+            </w:tcBorders>
           </w:tcPr>
           <w:p>
+            <w:pPr>
+              <w:spacing w:line="312" w:lineRule="auto" w:before="40" w:after="40"/>
+              <w:ind w:firstLine="0"/>
+              <w:jc w:val="center"/>
+            </w:pPr>
             <w:r>
-              <w:t>-</w:t>
+              <w:rPr>
+                <w:rFonts w:ascii="Times New Roman" w:hAnsi="Times New Roman"/>
+                <w:b w:val="0"/>
+                <w:color w:val="000000"/>
+                <w:sz w:val="24"/>
+              </w:rPr>
+              <w:t>3</w:t>
             </w:r>
           </w:p>
         </w:tc>
@@ -2092,10 +2918,35 @@
               <w:right w:w="70" w:type="dxa"/>
             </w:tcMar>
             <w:vAlign w:val="center"/>
+            <w:tcMar>
+              <w:top w:w="80" w:type="dxa"/>
+              <w:bottom w:w="80" w:type="dxa"/>
+              <w:left w:w="100" w:type="dxa"/>
+              <w:right w:w="100" w:type="dxa"/>
+            </w:tcMar>
+            <w:tcBorders>
+              <w:top w:val="single" w:sz="4" w:space="0" w:color="000000"/>
+              <w:left w:val="single" w:sz="4" w:space="0" w:color="000000"/>
+              <w:bottom w:val="single" w:sz="4" w:space="0" w:color="000000"/>
+              <w:right w:val="single" w:sz="4" w:space="0" w:color="000000"/>
+            </w:tcBorders>
           </w:tcPr>
           <w:p>
+            <w:pPr>
+              <w:spacing w:line="312" w:lineRule="auto" w:before="40" w:after="40"/>
+              <w:ind w:firstLine="0"/>
+              <w:jc w:val="left"/>
+            </w:pPr>
             <w:r>
-              <w:t>Không có</w:t>
+              <w:rPr>
+                <w:rFonts w:ascii="Times New Roman" w:hAnsi="Times New Roman"/>
+                <w:b/>
+                <w:color w:val="000000"/>
+                <w:sz w:val="24"/>
+              </w:rPr>
+              <w:t>Võ Huỳnh Gia Huy</w:t>
+              <w:br/>
+              <w:t>MSSV: 2001230303</w:t>
             </w:r>
           </w:p>
         </w:tc>
@@ -2110,10 +2961,33 @@
               <w:right w:w="70" w:type="dxa"/>
             </w:tcMar>
             <w:vAlign w:val="center"/>
+            <w:tcMar>
+              <w:top w:w="80" w:type="dxa"/>
+              <w:bottom w:w="80" w:type="dxa"/>
+              <w:left w:w="100" w:type="dxa"/>
+              <w:right w:w="100" w:type="dxa"/>
+            </w:tcMar>
+            <w:tcBorders>
+              <w:top w:val="single" w:sz="4" w:space="0" w:color="000000"/>
+              <w:left w:val="single" w:sz="4" w:space="0" w:color="000000"/>
+              <w:bottom w:val="single" w:sz="4" w:space="0" w:color="000000"/>
+              <w:right w:val="single" w:sz="4" w:space="0" w:color="000000"/>
+            </w:tcBorders>
           </w:tcPr>
           <w:p>
+            <w:pPr>
+              <w:spacing w:line="312" w:lineRule="auto" w:before="40" w:after="40"/>
+              <w:ind w:firstLine="0"/>
+              <w:jc w:val="left"/>
+            </w:pPr>
             <w:r>
-              <w:t>-</w:t>
+              <w:rPr>
+                <w:rFonts w:ascii="Times New Roman" w:hAnsi="Times New Roman"/>
+                <w:b w:val="0"/>
+                <w:color w:val="000000"/>
+                <w:sz w:val="22"/>
+              </w:rPr>
+              <w:t>Thiết kế mô hình đồ thị thuộc tính (Labeled Property Graph) trên Neo4j, xây dựng thuật toán gợi ý Bạn Cùng Tiến (Study Buddies) và Đồ thị bài học phụ thuộc (Prerequisite Path), xây dựng hệ sinh thái Gamification đổi quà bằng điểm thưởng XP trên Redis &amp; MongoDB, thực hiện sao lưu/phục hồi dữ liệu, biên soạn Chương 6, 8.</w:t>
             </w:r>
           </w:p>
         </w:tc>
@@ -2128,10 +3002,33 @@
               <w:right w:w="70" w:type="dxa"/>
             </w:tcMar>
             <w:vAlign w:val="center"/>
+            <w:tcMar>
+              <w:top w:w="80" w:type="dxa"/>
+              <w:bottom w:w="80" w:type="dxa"/>
+              <w:left w:w="100" w:type="dxa"/>
+              <w:right w:w="100" w:type="dxa"/>
+            </w:tcMar>
+            <w:tcBorders>
+              <w:top w:val="single" w:sz="4" w:space="0" w:color="000000"/>
+              <w:left w:val="single" w:sz="4" w:space="0" w:color="000000"/>
+              <w:bottom w:val="single" w:sz="4" w:space="0" w:color="000000"/>
+              <w:right w:val="single" w:sz="4" w:space="0" w:color="000000"/>
+            </w:tcBorders>
           </w:tcPr>
           <w:p>
+            <w:pPr>
+              <w:spacing w:line="312" w:lineRule="auto" w:before="40" w:after="40"/>
+              <w:ind w:firstLine="0"/>
+              <w:jc w:val="center"/>
+            </w:pPr>
             <w:r>
-              <w:t>-</w:t>
+              <w:rPr>
+                <w:rFonts w:ascii="Times New Roman" w:hAnsi="Times New Roman"/>
+                <w:b/>
+                <w:color w:val="000000"/>
+                <w:sz w:val="24"/>
+              </w:rPr>
+              <w:t>30%</w:t>
             </w:r>
           </w:p>
         </w:tc>
@@ -2139,7 +3036,8 @@
     </w:tbl>
     <w:p>
       <w:pPr>
-        <w:spacing w:after="20"/>
+        <w:spacing w:after="20" w:line="312" w:lineRule="auto"/>
+        <w:ind w:firstLine="0"/>
         <w:rPr>
           <w:rFonts w:ascii="Times New Roman" w:hAnsi="Times New Roman" w:cs="Times New Roman"/>
           <w:sz w:val="26"/>
@@ -2150,7 +3048,8 @@
     <w:p>
       <w:pPr>
         <w:pStyle w:val="Heading1"/>
-        <w:spacing w:before="160" w:after="60"/>
+        <w:spacing w:before="160" w:after="60" w:line="312" w:lineRule="auto"/>
+        <w:ind w:firstLine="0"/>
         <w:rPr>
           <w:rFonts w:ascii="Times New Roman" w:hAnsi="Times New Roman" w:cs="Times New Roman"/>
           <w:sz w:val="26"/>
@@ -2160,7 +3059,7 @@
       <w:r>
         <w:rPr>
           <w:rFonts w:ascii="Times New Roman" w:eastAsia="Arial" w:hAnsi="Times New Roman" w:cs="Times New Roman"/>
-          <w:color w:val="1F4E79"/>
+          <w:color w:val="000000"/>
           <w:sz w:val="26"/>
           <w:szCs w:val="26"/>
         </w:rPr>
@@ -2195,94 +3094,33 @@
               <w:right w:w="70" w:type="dxa"/>
             </w:tcMar>
             <w:vAlign w:val="center"/>
+            <w:tcMar>
+              <w:top w:w="80" w:type="dxa"/>
+              <w:bottom w:w="80" w:type="dxa"/>
+              <w:left w:w="100" w:type="dxa"/>
+              <w:right w:w="100" w:type="dxa"/>
+            </w:tcMar>
+            <w:tcBorders>
+              <w:top w:val="single" w:sz="4" w:space="0" w:color="000000"/>
+              <w:left w:val="single" w:sz="4" w:space="0" w:color="000000"/>
+              <w:bottom w:val="single" w:sz="4" w:space="0" w:color="000000"/>
+              <w:right w:val="single" w:sz="4" w:space="0" w:color="000000"/>
+            </w:tcBorders>
           </w:tcPr>
           <w:p>
             <w:pPr>
-              <w:rPr>
-                <w:rFonts w:ascii="Times New Roman" w:hAnsi="Times New Roman" w:cs="Times New Roman"/>
-                <w:sz w:val="26"/>
-                <w:szCs w:val="26"/>
-              </w:rPr>
+              <w:spacing w:line="312" w:lineRule="auto" w:before="40" w:after="40"/>
+              <w:ind w:firstLine="0"/>
+              <w:jc w:val="left"/>
             </w:pPr>
-            <w:proofErr w:type="spellStart"/>
             <w:r>
               <w:rPr>
-                <w:rFonts w:ascii="Times New Roman" w:eastAsia="Arial" w:hAnsi="Times New Roman" w:cs="Times New Roman"/>
+                <w:rFonts w:ascii="Times New Roman" w:hAnsi="Times New Roman"/>
                 <w:b/>
-                <w:sz w:val="26"/>
-                <w:szCs w:val="26"/>
+                <w:color w:val="000000"/>
+                <w:sz w:val="24"/>
               </w:rPr>
-              <w:t>Bài</w:t>
-            </w:r>
-            <w:proofErr w:type="spellEnd"/>
-            <w:r>
-              <w:rPr>
-                <w:rFonts w:ascii="Times New Roman" w:eastAsia="Arial" w:hAnsi="Times New Roman" w:cs="Times New Roman"/>
-                <w:b/>
-                <w:sz w:val="26"/>
-                <w:szCs w:val="26"/>
-              </w:rPr>
-              <w:t xml:space="preserve"> </w:t>
-            </w:r>
-            <w:proofErr w:type="spellStart"/>
-            <w:r>
-              <w:rPr>
-                <w:rFonts w:ascii="Times New Roman" w:eastAsia="Arial" w:hAnsi="Times New Roman" w:cs="Times New Roman"/>
-                <w:b/>
-                <w:sz w:val="26"/>
-                <w:szCs w:val="26"/>
-              </w:rPr>
-              <w:t>toán</w:t>
-            </w:r>
-            <w:proofErr w:type="spellEnd"/>
-            <w:r>
-              <w:rPr>
-                <w:rFonts w:ascii="Times New Roman" w:eastAsia="Arial" w:hAnsi="Times New Roman" w:cs="Times New Roman"/>
-                <w:b/>
-                <w:sz w:val="26"/>
-                <w:szCs w:val="26"/>
-              </w:rPr>
-              <w:t xml:space="preserve"> </w:t>
-            </w:r>
-            <w:proofErr w:type="spellStart"/>
-            <w:r>
-              <w:rPr>
-                <w:rFonts w:ascii="Times New Roman" w:eastAsia="Arial" w:hAnsi="Times New Roman" w:cs="Times New Roman"/>
-                <w:b/>
-                <w:sz w:val="26"/>
-                <w:szCs w:val="26"/>
-              </w:rPr>
-              <w:t>cần</w:t>
-            </w:r>
-            <w:proofErr w:type="spellEnd"/>
-            <w:r>
-              <w:rPr>
-                <w:rFonts w:ascii="Times New Roman" w:eastAsia="Arial" w:hAnsi="Times New Roman" w:cs="Times New Roman"/>
-                <w:b/>
-                <w:sz w:val="26"/>
-                <w:szCs w:val="26"/>
-              </w:rPr>
-              <w:t xml:space="preserve"> </w:t>
-            </w:r>
-            <w:proofErr w:type="spellStart"/>
-            <w:r>
-              <w:rPr>
-                <w:rFonts w:ascii="Times New Roman" w:eastAsia="Arial" w:hAnsi="Times New Roman" w:cs="Times New Roman"/>
-                <w:b/>
-                <w:sz w:val="26"/>
-                <w:szCs w:val="26"/>
-              </w:rPr>
-              <w:t>giải</w:t>
-            </w:r>
-            <w:proofErr w:type="spellEnd"/>
-            <w:r>
-              <w:rPr>
-                <w:rFonts w:ascii="Times New Roman" w:eastAsia="Arial" w:hAnsi="Times New Roman" w:cs="Times New Roman"/>
-                <w:b/>
-                <w:sz w:val="26"/>
-                <w:szCs w:val="26"/>
-              </w:rPr>
-              <w:t xml:space="preserve"> quyết</w:t>
+              <w:t>Bài toán cần giải quyết</w:t>
             </w:r>
           </w:p>
         </w:tc>
@@ -2297,10 +3135,33 @@
               <w:right w:w="70" w:type="dxa"/>
             </w:tcMar>
             <w:vAlign w:val="center"/>
+            <w:tcMar>
+              <w:top w:w="80" w:type="dxa"/>
+              <w:bottom w:w="80" w:type="dxa"/>
+              <w:left w:w="100" w:type="dxa"/>
+              <w:right w:w="100" w:type="dxa"/>
+            </w:tcMar>
+            <w:tcBorders>
+              <w:top w:val="single" w:sz="4" w:space="0" w:color="000000"/>
+              <w:left w:val="single" w:sz="4" w:space="0" w:color="000000"/>
+              <w:bottom w:val="single" w:sz="4" w:space="0" w:color="000000"/>
+              <w:right w:val="single" w:sz="4" w:space="0" w:color="000000"/>
+            </w:tcBorders>
           </w:tcPr>
           <w:p>
+            <w:pPr>
+              <w:spacing w:line="312" w:lineRule="auto" w:before="40" w:after="40"/>
+              <w:ind w:firstLine="0"/>
+              <w:jc w:val="left"/>
+            </w:pPr>
             <w:r>
-              <w:t>Xây dựng nền tảng E-Learning và khảo sát năng lực tiếng Anh trực tuyến đáp ứng lưu lượng truy cập lớn, thời gian thực, độ trễ thấp và phân tích dữ liệu đa chiều bằng cách kết hợp sức mạnh của 4 mô hình NoSQL.</w:t>
+              <w:rPr>
+                <w:rFonts w:ascii="Times New Roman" w:hAnsi="Times New Roman"/>
+                <w:b w:val="0"/>
+                <w:color w:val="000000"/>
+                <w:sz w:val="22"/>
+              </w:rPr>
+              <w:t>Giải quyết bài toán lưu trữ và xử lý đa chiều trong hệ thống E-Learning đào tạo tiếng Anh thực chiến có lượng truy cập lớn và dữ liệu biến động cao: loại bỏ hoàn toàn các điểm nghẽn của RDBMS truyền thống về khóa dòng khi nộp bài dồn dập, quá tải I/O đĩa từ khi ghi log hành vi chuỗi thời gian (Write-Heavy), cấu trúc bài giảng linh hoạt đa định dạng và chi phí bùng nổ khi JOIN đệ quy duyệt đồ thị lộ trình học tập.</w:t>
             </w:r>
           </w:p>
         </w:tc>
@@ -2321,21 +3182,31 @@
               <w:right w:w="70" w:type="dxa"/>
             </w:tcMar>
             <w:vAlign w:val="center"/>
+            <w:tcMar>
+              <w:top w:w="80" w:type="dxa"/>
+              <w:bottom w:w="80" w:type="dxa"/>
+              <w:left w:w="100" w:type="dxa"/>
+              <w:right w:w="100" w:type="dxa"/>
+            </w:tcMar>
+            <w:tcBorders>
+              <w:top w:val="single" w:sz="4" w:space="0" w:color="000000"/>
+              <w:left w:val="single" w:sz="4" w:space="0" w:color="000000"/>
+              <w:bottom w:val="single" w:sz="4" w:space="0" w:color="000000"/>
+              <w:right w:val="single" w:sz="4" w:space="0" w:color="000000"/>
+            </w:tcBorders>
           </w:tcPr>
           <w:p>
             <w:pPr>
-              <w:rPr>
-                <w:rFonts w:ascii="Times New Roman" w:hAnsi="Times New Roman" w:cs="Times New Roman"/>
-                <w:sz w:val="26"/>
-                <w:szCs w:val="26"/>
-              </w:rPr>
+              <w:spacing w:line="312" w:lineRule="auto" w:before="40" w:after="40"/>
+              <w:ind w:firstLine="0"/>
+              <w:jc w:val="left"/>
             </w:pPr>
             <w:r>
               <w:rPr>
-                <w:rFonts w:ascii="Times New Roman" w:eastAsia="Arial" w:hAnsi="Times New Roman" w:cs="Times New Roman"/>
+                <w:rFonts w:ascii="Times New Roman" w:hAnsi="Times New Roman"/>
                 <w:b/>
-                <w:sz w:val="26"/>
-                <w:szCs w:val="26"/>
+                <w:color w:val="000000"/>
+                <w:sz w:val="24"/>
               </w:rPr>
               <w:t>Đối tượng sử dụng</w:t>
             </w:r>
@@ -2352,10 +3223,39 @@
               <w:right w:w="70" w:type="dxa"/>
             </w:tcMar>
             <w:vAlign w:val="center"/>
+            <w:tcMar>
+              <w:top w:w="80" w:type="dxa"/>
+              <w:bottom w:w="80" w:type="dxa"/>
+              <w:left w:w="100" w:type="dxa"/>
+              <w:right w:w="100" w:type="dxa"/>
+            </w:tcMar>
+            <w:tcBorders>
+              <w:top w:val="single" w:sz="4" w:space="0" w:color="000000"/>
+              <w:left w:val="single" w:sz="4" w:space="0" w:color="000000"/>
+              <w:bottom w:val="single" w:sz="4" w:space="0" w:color="000000"/>
+              <w:right w:val="single" w:sz="4" w:space="0" w:color="000000"/>
+            </w:tcBorders>
           </w:tcPr>
           <w:p>
+            <w:pPr>
+              <w:spacing w:line="312" w:lineRule="auto" w:before="40" w:after="40"/>
+              <w:ind w:firstLine="0"/>
+              <w:jc w:val="left"/>
+            </w:pPr>
             <w:r>
-              <w:t>Học viên (Student), Giảng viên (Teacher), Quản trị viên (Admin).</w:t>
+              <w:rPr>
+                <w:rFonts w:ascii="Times New Roman" w:hAnsi="Times New Roman"/>
+                <w:b w:val="0"/>
+                <w:color w:val="000000"/>
+                <w:sz w:val="22"/>
+              </w:rPr>
+              <w:t>Bao gồm 3 nhóm tác nhân chính:</w:t>
+              <w:br/>
+              <w:t>• Học viên (Student): Tham gia học tập, rèn luyện từ vựng, làm bài thi khảo sát trực tuyến, đổi quà Gamification bằng XP.</w:t>
+              <w:br/>
+              <w:t>• Giảng viên (Teacher): Quản lý khóa học, biên tập ngân hàng câu hỏi, tạo bài kiểm tra, theo dõi tỷ lệ giữ chân video học viên.</w:t>
+              <w:br/>
+              <w:t>• Quản trị viên (Admin): Giám sát hệ thống, kiểm duyệt nội dung, quản lý phân quyền, cấu hình an ninh và bảo mật.</w:t>
             </w:r>
           </w:p>
         </w:tc>
@@ -2376,21 +3276,31 @@
               <w:right w:w="70" w:type="dxa"/>
             </w:tcMar>
             <w:vAlign w:val="center"/>
+            <w:tcMar>
+              <w:top w:w="80" w:type="dxa"/>
+              <w:bottom w:w="80" w:type="dxa"/>
+              <w:left w:w="100" w:type="dxa"/>
+              <w:right w:w="100" w:type="dxa"/>
+            </w:tcMar>
+            <w:tcBorders>
+              <w:top w:val="single" w:sz="4" w:space="0" w:color="000000"/>
+              <w:left w:val="single" w:sz="4" w:space="0" w:color="000000"/>
+              <w:bottom w:val="single" w:sz="4" w:space="0" w:color="000000"/>
+              <w:right w:val="single" w:sz="4" w:space="0" w:color="000000"/>
+            </w:tcBorders>
           </w:tcPr>
           <w:p>
             <w:pPr>
-              <w:rPr>
-                <w:rFonts w:ascii="Times New Roman" w:hAnsi="Times New Roman" w:cs="Times New Roman"/>
-                <w:sz w:val="26"/>
-                <w:szCs w:val="26"/>
-              </w:rPr>
+              <w:spacing w:line="312" w:lineRule="auto" w:before="40" w:after="40"/>
+              <w:ind w:firstLine="0"/>
+              <w:jc w:val="left"/>
             </w:pPr>
             <w:r>
               <w:rPr>
-                <w:rFonts w:ascii="Times New Roman" w:eastAsia="Arial" w:hAnsi="Times New Roman" w:cs="Times New Roman"/>
+                <w:rFonts w:ascii="Times New Roman" w:hAnsi="Times New Roman"/>
                 <w:b/>
-                <w:sz w:val="26"/>
-                <w:szCs w:val="26"/>
+                <w:color w:val="000000"/>
+                <w:sz w:val="24"/>
               </w:rPr>
               <w:t>Chức năng chính</w:t>
             </w:r>
@@ -2407,20 +3317,45 @@
               <w:right w:w="70" w:type="dxa"/>
             </w:tcMar>
             <w:vAlign w:val="center"/>
+            <w:tcMar>
+              <w:top w:w="80" w:type="dxa"/>
+              <w:bottom w:w="80" w:type="dxa"/>
+              <w:left w:w="100" w:type="dxa"/>
+              <w:right w:w="100" w:type="dxa"/>
+            </w:tcMar>
+            <w:tcBorders>
+              <w:top w:val="single" w:sz="4" w:space="0" w:color="000000"/>
+              <w:left w:val="single" w:sz="4" w:space="0" w:color="000000"/>
+              <w:bottom w:val="single" w:sz="4" w:space="0" w:color="000000"/>
+              <w:right w:val="single" w:sz="4" w:space="0" w:color="000000"/>
+            </w:tcBorders>
           </w:tcPr>
           <w:p>
+            <w:pPr>
+              <w:spacing w:line="312" w:lineRule="auto" w:before="40" w:after="40"/>
+              <w:ind w:firstLine="0"/>
+              <w:jc w:val="left"/>
+            </w:pPr>
             <w:r>
-              <w:t>• Khảo sát năng lực Placement Test &amp; Thi chứng chỉ (IELTS, TOEIC)</w:t>
+              <w:rPr>
+                <w:rFonts w:ascii="Times New Roman" w:hAnsi="Times New Roman"/>
+                <w:b w:val="0"/>
+                <w:color w:val="000000"/>
+                <w:sz w:val="22"/>
+              </w:rPr>
+              <w:t>• Khảo sát năng lực Placement Test &amp; Thi chứng chỉ (IELTS, TOEIC) thời gian thực</w:t>
               <w:br/>
-              <w:t>• Phòng chống gian lận thi cử (Anti-cheat 3/3 cảnh báo)</w:t>
+              <w:t>• Hệ thống chống gian lận thi cử thông minh Anti-cheat 3/3 lần cảnh báo</w:t>
               <w:br/>
-              <w:t>• Luyện từ vựng thông minh &amp; Phòng thực hành AI Writing</w:t>
+              <w:t>• Sổ tay từ vựng Flashcard cá nhân hóa &amp; Phòng thực hành AI Writing Lab</w:t>
               <w:br/>
-              <w:t>• Bảng xếp hạng thi đua thời gian thực (Real-time Leaderboard)</w:t>
+              <w:t>• Bảng xếp hạng thi đua tuần thời gian thực (Real-time Leaderboard)</w:t>
               <w:br/>
-              <w:t>• Gợi ý lộ trình học tập &amp; Bạn học cùng tiến (Learning Path &amp; Study Buddies)</w:t>
+              <w:t>• Gợi ý lộ trình bài học phụ thuộc (Learning Path) &amp; Mạng lưới bạn học cùng tiến (Study Buddies)</w:t>
               <w:br/>
-              <w:t>• Ghi nhận tiến độ học tập chuỗi thời gian (Time-series Event Logging)</w:t>
+              <w:t>• Ghi nhận tiến độ học tập chuỗi thời gian phân tích tỷ lệ giữ chân video (Time-series Event Logging)</w:t>
+              <w:br/>
+              <w:t>• Cửa hàng Gamification đổi vật phẩm học tập bằng điểm thưởng XP</w:t>
             </w:r>
           </w:p>
         </w:tc>
@@ -2441,114 +3376,33 @@
               <w:right w:w="70" w:type="dxa"/>
             </w:tcMar>
             <w:vAlign w:val="center"/>
+            <w:tcMar>
+              <w:top w:w="80" w:type="dxa"/>
+              <w:bottom w:w="80" w:type="dxa"/>
+              <w:left w:w="100" w:type="dxa"/>
+              <w:right w:w="100" w:type="dxa"/>
+            </w:tcMar>
+            <w:tcBorders>
+              <w:top w:val="single" w:sz="4" w:space="0" w:color="000000"/>
+              <w:left w:val="single" w:sz="4" w:space="0" w:color="000000"/>
+              <w:bottom w:val="single" w:sz="4" w:space="0" w:color="000000"/>
+              <w:right w:val="single" w:sz="4" w:space="0" w:color="000000"/>
+            </w:tcBorders>
           </w:tcPr>
           <w:p>
             <w:pPr>
-              <w:rPr>
-                <w:rFonts w:ascii="Times New Roman" w:hAnsi="Times New Roman" w:cs="Times New Roman"/>
-                <w:sz w:val="26"/>
-                <w:szCs w:val="26"/>
-              </w:rPr>
+              <w:spacing w:line="312" w:lineRule="auto" w:before="40" w:after="40"/>
+              <w:ind w:firstLine="0"/>
+              <w:jc w:val="left"/>
             </w:pPr>
-            <w:proofErr w:type="spellStart"/>
             <w:r>
               <w:rPr>
-                <w:rFonts w:ascii="Times New Roman" w:eastAsia="Arial" w:hAnsi="Times New Roman" w:cs="Times New Roman"/>
+                <w:rFonts w:ascii="Times New Roman" w:hAnsi="Times New Roman"/>
                 <w:b/>
-                <w:sz w:val="26"/>
-                <w:szCs w:val="26"/>
+                <w:color w:val="000000"/>
+                <w:sz w:val="24"/>
               </w:rPr>
-              <w:t>Kiến</w:t>
-            </w:r>
-            <w:proofErr w:type="spellEnd"/>
-            <w:r>
-              <w:rPr>
-                <w:rFonts w:ascii="Times New Roman" w:eastAsia="Arial" w:hAnsi="Times New Roman" w:cs="Times New Roman"/>
-                <w:b/>
-                <w:sz w:val="26"/>
-                <w:szCs w:val="26"/>
-              </w:rPr>
-              <w:t xml:space="preserve"> </w:t>
-            </w:r>
-            <w:proofErr w:type="spellStart"/>
-            <w:r>
-              <w:rPr>
-                <w:rFonts w:ascii="Times New Roman" w:eastAsia="Arial" w:hAnsi="Times New Roman" w:cs="Times New Roman"/>
-                <w:b/>
-                <w:sz w:val="26"/>
-                <w:szCs w:val="26"/>
-              </w:rPr>
-              <w:t>trúc</w:t>
-            </w:r>
-            <w:proofErr w:type="spellEnd"/>
-            <w:r>
-              <w:rPr>
-                <w:rFonts w:ascii="Times New Roman" w:eastAsia="Arial" w:hAnsi="Times New Roman" w:cs="Times New Roman"/>
-                <w:b/>
-                <w:sz w:val="26"/>
-                <w:szCs w:val="26"/>
-              </w:rPr>
-              <w:t xml:space="preserve">, Công </w:t>
-            </w:r>
-            <w:proofErr w:type="spellStart"/>
-            <w:r>
-              <w:rPr>
-                <w:rFonts w:ascii="Times New Roman" w:eastAsia="Arial" w:hAnsi="Times New Roman" w:cs="Times New Roman"/>
-                <w:b/>
-                <w:sz w:val="26"/>
-                <w:szCs w:val="26"/>
-              </w:rPr>
-              <w:t>nghệ</w:t>
-            </w:r>
-            <w:proofErr w:type="spellEnd"/>
-            <w:r>
-              <w:rPr>
-                <w:rFonts w:ascii="Times New Roman" w:eastAsia="Arial" w:hAnsi="Times New Roman" w:cs="Times New Roman"/>
-                <w:b/>
-                <w:sz w:val="26"/>
-                <w:szCs w:val="26"/>
-              </w:rPr>
-              <w:t xml:space="preserve"> </w:t>
-            </w:r>
-            <w:proofErr w:type="spellStart"/>
-            <w:r>
-              <w:rPr>
-                <w:rFonts w:ascii="Times New Roman" w:eastAsia="Arial" w:hAnsi="Times New Roman" w:cs="Times New Roman"/>
-                <w:b/>
-                <w:sz w:val="26"/>
-                <w:szCs w:val="26"/>
-              </w:rPr>
-              <w:t>sử</w:t>
-            </w:r>
-            <w:proofErr w:type="spellEnd"/>
-            <w:r>
-              <w:rPr>
-                <w:rFonts w:ascii="Times New Roman" w:eastAsia="Arial" w:hAnsi="Times New Roman" w:cs="Times New Roman"/>
-                <w:b/>
-                <w:sz w:val="26"/>
-                <w:szCs w:val="26"/>
-              </w:rPr>
-              <w:t xml:space="preserve"> </w:t>
-            </w:r>
-            <w:proofErr w:type="spellStart"/>
-            <w:r>
-              <w:rPr>
-                <w:rFonts w:ascii="Times New Roman" w:eastAsia="Arial" w:hAnsi="Times New Roman" w:cs="Times New Roman"/>
-                <w:b/>
-                <w:sz w:val="26"/>
-                <w:szCs w:val="26"/>
-              </w:rPr>
-              <w:t>dụng</w:t>
-            </w:r>
-            <w:proofErr w:type="spellEnd"/>
-            <w:r>
-              <w:rPr>
-                <w:rFonts w:ascii="Times New Roman" w:eastAsia="Arial" w:hAnsi="Times New Roman" w:cs="Times New Roman"/>
-                <w:b/>
-                <w:sz w:val="26"/>
-                <w:szCs w:val="26"/>
-              </w:rPr>
-              <w:t xml:space="preserve"> </w:t>
+              <w:t>Kiến trúc, Công nghệ sử dụng</w:t>
             </w:r>
           </w:p>
         </w:tc>
@@ -2563,14 +3417,37 @@
               <w:right w:w="70" w:type="dxa"/>
             </w:tcMar>
             <w:vAlign w:val="center"/>
+            <w:tcMar>
+              <w:top w:w="80" w:type="dxa"/>
+              <w:bottom w:w="80" w:type="dxa"/>
+              <w:left w:w="100" w:type="dxa"/>
+              <w:right w:w="100" w:type="dxa"/>
+            </w:tcMar>
+            <w:tcBorders>
+              <w:top w:val="single" w:sz="4" w:space="0" w:color="000000"/>
+              <w:left w:val="single" w:sz="4" w:space="0" w:color="000000"/>
+              <w:bottom w:val="single" w:sz="4" w:space="0" w:color="000000"/>
+              <w:right w:val="single" w:sz="4" w:space="0" w:color="000000"/>
+            </w:tcBorders>
           </w:tcPr>
           <w:p>
+            <w:pPr>
+              <w:spacing w:line="312" w:lineRule="auto" w:before="40" w:after="40"/>
+              <w:ind w:firstLine="0"/>
+              <w:jc w:val="left"/>
+            </w:pPr>
             <w:r>
-              <w:t>• Frontend: HTML5, CSS3/Tailwind, JavaScript ES6 (Modular Component)</w:t>
+              <w:rPr>
+                <w:rFonts w:ascii="Times New Roman" w:hAnsi="Times New Roman"/>
+                <w:b w:val="0"/>
+                <w:color w:val="000000"/>
+                <w:sz w:val="22"/>
+              </w:rPr>
+              <w:t>• Frontend: HTML5, CSS3/Tailwind CSS, JavaScript ES6 (Kiến trúc Module hóa tại public/js/)</w:t>
               <w:br/>
-              <w:t>• Backend: Node.js, Express.js RESTful API</w:t>
+              <w:t>• Backend: Node.js 20+, Express.js RESTful API, Docker &amp; Docker Compose</w:t>
               <w:br/>
-              <w:t>• Test Runner: Node Test Runner tích hợp, 22 Test Cases tự động</w:t>
+              <w:t>• Testing: Node Test Runner tích hợp 22 Test Cases, k6 load testing, Chaos Engineering</w:t>
             </w:r>
           </w:p>
         </w:tc>
@@ -2591,103 +3468,33 @@
               <w:right w:w="70" w:type="dxa"/>
             </w:tcMar>
             <w:vAlign w:val="center"/>
+            <w:tcMar>
+              <w:top w:w="80" w:type="dxa"/>
+              <w:bottom w:w="80" w:type="dxa"/>
+              <w:left w:w="100" w:type="dxa"/>
+              <w:right w:w="100" w:type="dxa"/>
+            </w:tcMar>
+            <w:tcBorders>
+              <w:top w:val="single" w:sz="4" w:space="0" w:color="000000"/>
+              <w:left w:val="single" w:sz="4" w:space="0" w:color="000000"/>
+              <w:bottom w:val="single" w:sz="4" w:space="0" w:color="000000"/>
+              <w:right w:val="single" w:sz="4" w:space="0" w:color="000000"/>
+            </w:tcBorders>
           </w:tcPr>
           <w:p>
             <w:pPr>
-              <w:rPr>
-                <w:rFonts w:ascii="Times New Roman" w:hAnsi="Times New Roman" w:cs="Times New Roman"/>
-                <w:sz w:val="26"/>
-                <w:szCs w:val="26"/>
-              </w:rPr>
+              <w:spacing w:line="312" w:lineRule="auto" w:before="40" w:after="40"/>
+              <w:ind w:firstLine="0"/>
+              <w:jc w:val="left"/>
             </w:pPr>
             <w:r>
               <w:rPr>
-                <w:rFonts w:ascii="Times New Roman" w:eastAsia="Arial" w:hAnsi="Times New Roman" w:cs="Times New Roman"/>
+                <w:rFonts w:ascii="Times New Roman" w:hAnsi="Times New Roman"/>
                 <w:b/>
-                <w:sz w:val="26"/>
-                <w:szCs w:val="26"/>
+                <w:color w:val="000000"/>
+                <w:sz w:val="24"/>
               </w:rPr>
-              <w:t xml:space="preserve">RDBMS </w:t>
-            </w:r>
-            <w:proofErr w:type="spellStart"/>
-            <w:r>
-              <w:rPr>
-                <w:rFonts w:ascii="Times New Roman" w:eastAsia="Arial" w:hAnsi="Times New Roman" w:cs="Times New Roman"/>
-                <w:b/>
-                <w:sz w:val="26"/>
-                <w:szCs w:val="26"/>
-              </w:rPr>
-              <w:t>sử</w:t>
-            </w:r>
-            <w:proofErr w:type="spellEnd"/>
-            <w:r>
-              <w:rPr>
-                <w:rFonts w:ascii="Times New Roman" w:eastAsia="Arial" w:hAnsi="Times New Roman" w:cs="Times New Roman"/>
-                <w:b/>
-                <w:sz w:val="26"/>
-                <w:szCs w:val="26"/>
-              </w:rPr>
-              <w:t xml:space="preserve"> </w:t>
-            </w:r>
-            <w:proofErr w:type="spellStart"/>
-            <w:r>
-              <w:rPr>
-                <w:rFonts w:ascii="Times New Roman" w:eastAsia="Arial" w:hAnsi="Times New Roman" w:cs="Times New Roman"/>
-                <w:b/>
-                <w:sz w:val="26"/>
-                <w:szCs w:val="26"/>
-              </w:rPr>
-              <w:t>dụng</w:t>
-            </w:r>
-            <w:proofErr w:type="spellEnd"/>
-            <w:r>
-              <w:rPr>
-                <w:rFonts w:ascii="Times New Roman" w:eastAsia="Arial" w:hAnsi="Times New Roman" w:cs="Times New Roman"/>
-                <w:b/>
-                <w:sz w:val="26"/>
-                <w:szCs w:val="26"/>
-              </w:rPr>
-              <w:t xml:space="preserve"> (</w:t>
-            </w:r>
-            <w:proofErr w:type="spellStart"/>
-            <w:r>
-              <w:rPr>
-                <w:rFonts w:ascii="Times New Roman" w:eastAsia="Arial" w:hAnsi="Times New Roman" w:cs="Times New Roman"/>
-                <w:b/>
-                <w:sz w:val="26"/>
-                <w:szCs w:val="26"/>
-              </w:rPr>
-              <w:t>nếu</w:t>
-            </w:r>
-            <w:proofErr w:type="spellEnd"/>
-            <w:r>
-              <w:rPr>
-                <w:rFonts w:ascii="Times New Roman" w:eastAsia="Arial" w:hAnsi="Times New Roman" w:cs="Times New Roman"/>
-                <w:b/>
-                <w:sz w:val="26"/>
-                <w:szCs w:val="26"/>
-              </w:rPr>
-              <w:t xml:space="preserve"> </w:t>
-            </w:r>
-            <w:proofErr w:type="spellStart"/>
-            <w:r>
-              <w:rPr>
-                <w:rFonts w:ascii="Times New Roman" w:eastAsia="Arial" w:hAnsi="Times New Roman" w:cs="Times New Roman"/>
-                <w:b/>
-                <w:sz w:val="26"/>
-                <w:szCs w:val="26"/>
-              </w:rPr>
-              <w:t>có</w:t>
-            </w:r>
-            <w:proofErr w:type="spellEnd"/>
-            <w:r>
-              <w:rPr>
-                <w:rFonts w:ascii="Times New Roman" w:eastAsia="Arial" w:hAnsi="Times New Roman" w:cs="Times New Roman"/>
-                <w:b/>
-                <w:sz w:val="26"/>
-                <w:szCs w:val="26"/>
-              </w:rPr>
-              <w:t>)</w:t>
+              <w:t>RDBMS sử dụng (nếu có)</w:t>
             </w:r>
           </w:p>
         </w:tc>
@@ -2702,10 +3509,33 @@
               <w:right w:w="70" w:type="dxa"/>
             </w:tcMar>
             <w:vAlign w:val="center"/>
+            <w:tcMar>
+              <w:top w:w="80" w:type="dxa"/>
+              <w:bottom w:w="80" w:type="dxa"/>
+              <w:left w:w="100" w:type="dxa"/>
+              <w:right w:w="100" w:type="dxa"/>
+            </w:tcMar>
+            <w:tcBorders>
+              <w:top w:val="single" w:sz="4" w:space="0" w:color="000000"/>
+              <w:left w:val="single" w:sz="4" w:space="0" w:color="000000"/>
+              <w:bottom w:val="single" w:sz="4" w:space="0" w:color="000000"/>
+              <w:right w:val="single" w:sz="4" w:space="0" w:color="000000"/>
+            </w:tcBorders>
           </w:tcPr>
           <w:p>
+            <w:pPr>
+              <w:spacing w:line="312" w:lineRule="auto" w:before="40" w:after="40"/>
+              <w:ind w:firstLine="0"/>
+              <w:jc w:val="left"/>
+            </w:pPr>
             <w:r>
-              <w:t>Không sử dụng (Hệ thống kiến trúc hoàn toàn trên Polyglot NoSQL)</w:t>
+              <w:rPr>
+                <w:rFonts w:ascii="Times New Roman" w:hAnsi="Times New Roman"/>
+                <w:b w:val="0"/>
+                <w:color w:val="000000"/>
+                <w:sz w:val="22"/>
+              </w:rPr>
+              <w:t>Không sử dụng (Hệ thống kiến trúc hoàn toàn 100% trên nền tảng Polyglot NoSQL đa mô hình)</w:t>
             </w:r>
           </w:p>
         </w:tc>
@@ -2727,77 +3557,34 @@
               <w:right w:w="70" w:type="dxa"/>
             </w:tcMar>
             <w:vAlign w:val="center"/>
+            <w:tcMar>
+              <w:top w:w="80" w:type="dxa"/>
+              <w:bottom w:w="80" w:type="dxa"/>
+              <w:left w:w="100" w:type="dxa"/>
+              <w:right w:w="100" w:type="dxa"/>
+            </w:tcMar>
+            <w:tcBorders>
+              <w:top w:val="single" w:sz="4" w:space="0" w:color="000000"/>
+              <w:left w:val="single" w:sz="4" w:space="0" w:color="000000"/>
+              <w:bottom w:val="single" w:sz="4" w:space="0" w:color="000000"/>
+              <w:right w:val="single" w:sz="4" w:space="0" w:color="000000"/>
+            </w:tcBorders>
           </w:tcPr>
           <w:p>
             <w:pPr>
-              <w:rPr>
-                <w:rFonts w:ascii="Times New Roman" w:eastAsia="Arial" w:hAnsi="Times New Roman" w:cs="Times New Roman"/>
-                <w:b/>
-                <w:sz w:val="26"/>
-                <w:szCs w:val="26"/>
-              </w:rPr>
+              <w:spacing w:line="312" w:lineRule="auto" w:before="40" w:after="40"/>
+              <w:ind w:firstLine="0"/>
+              <w:jc w:val="left"/>
             </w:pPr>
             <w:r>
               <w:rPr>
-                <w:rFonts w:ascii="Times New Roman" w:eastAsia="Arial" w:hAnsi="Times New Roman" w:cs="Times New Roman"/>
+                <w:rFonts w:ascii="Times New Roman" w:hAnsi="Times New Roman"/>
                 <w:b/>
-                <w:sz w:val="26"/>
-                <w:szCs w:val="26"/>
+                <w:color w:val="000000"/>
+                <w:sz w:val="24"/>
               </w:rPr>
-              <w:lastRenderedPageBreak/>
-              <w:t xml:space="preserve">Các </w:t>
+              <w:t>Các hệ NoSQL sử dụng</w:t>
             </w:r>
-            <w:proofErr w:type="spellStart"/>
-            <w:r>
-              <w:rPr>
-                <w:rFonts w:ascii="Times New Roman" w:eastAsia="Arial" w:hAnsi="Times New Roman" w:cs="Times New Roman"/>
-                <w:b/>
-                <w:sz w:val="26"/>
-                <w:szCs w:val="26"/>
-              </w:rPr>
-              <w:t>hệ</w:t>
-            </w:r>
-            <w:proofErr w:type="spellEnd"/>
-            <w:r>
-              <w:rPr>
-                <w:rFonts w:ascii="Times New Roman" w:eastAsia="Arial" w:hAnsi="Times New Roman" w:cs="Times New Roman"/>
-                <w:b/>
-                <w:sz w:val="26"/>
-                <w:szCs w:val="26"/>
-              </w:rPr>
-              <w:t xml:space="preserve"> NoSQL </w:t>
-            </w:r>
-            <w:proofErr w:type="spellStart"/>
-            <w:r>
-              <w:rPr>
-                <w:rFonts w:ascii="Times New Roman" w:eastAsia="Arial" w:hAnsi="Times New Roman" w:cs="Times New Roman"/>
-                <w:b/>
-                <w:sz w:val="26"/>
-                <w:szCs w:val="26"/>
-              </w:rPr>
-              <w:t>sử</w:t>
-            </w:r>
-            <w:proofErr w:type="spellEnd"/>
-            <w:r>
-              <w:rPr>
-                <w:rFonts w:ascii="Times New Roman" w:eastAsia="Arial" w:hAnsi="Times New Roman" w:cs="Times New Roman"/>
-                <w:b/>
-                <w:sz w:val="26"/>
-                <w:szCs w:val="26"/>
-              </w:rPr>
-              <w:t xml:space="preserve"> </w:t>
-            </w:r>
-            <w:proofErr w:type="spellStart"/>
-            <w:r>
-              <w:rPr>
-                <w:rFonts w:ascii="Times New Roman" w:eastAsia="Arial" w:hAnsi="Times New Roman" w:cs="Times New Roman"/>
-                <w:b/>
-                <w:sz w:val="26"/>
-                <w:szCs w:val="26"/>
-              </w:rPr>
-              <w:t>dụng</w:t>
-            </w:r>
-            <w:proofErr w:type="spellEnd"/>
           </w:p>
         </w:tc>
         <w:tc>
@@ -2811,16 +3598,39 @@
               <w:right w:w="70" w:type="dxa"/>
             </w:tcMar>
             <w:vAlign w:val="center"/>
+            <w:tcMar>
+              <w:top w:w="80" w:type="dxa"/>
+              <w:bottom w:w="80" w:type="dxa"/>
+              <w:left w:w="100" w:type="dxa"/>
+              <w:right w:w="100" w:type="dxa"/>
+            </w:tcMar>
+            <w:tcBorders>
+              <w:top w:val="single" w:sz="4" w:space="0" w:color="000000"/>
+              <w:left w:val="single" w:sz="4" w:space="0" w:color="000000"/>
+              <w:bottom w:val="single" w:sz="4" w:space="0" w:color="000000"/>
+              <w:right w:val="single" w:sz="4" w:space="0" w:color="000000"/>
+            </w:tcBorders>
           </w:tcPr>
           <w:p>
+            <w:pPr>
+              <w:spacing w:line="312" w:lineRule="auto" w:before="40" w:after="40"/>
+              <w:ind w:firstLine="0"/>
+              <w:jc w:val="left"/>
+            </w:pPr>
             <w:r>
-              <w:t>1. MongoDB: Document Store lưu trữ Users, Courses, Exams, Questions, Flashcards, Results, Certificates.</w:t>
+              <w:rPr>
+                <w:rFonts w:ascii="Times New Roman" w:hAnsi="Times New Roman"/>
+                <w:b w:val="0"/>
+                <w:color w:val="000000"/>
+                <w:sz w:val="22"/>
+              </w:rPr>
+              <w:t>1. MongoDB (Document Store): Kho lưu trữ bền vững (Users, Courses, Lessons, Exams, Questions, Flashcards, Results, Certificates). Áp dụng quy tắc chỉ mục ESR và Schema Validation.</w:t>
               <w:br/>
-              <w:t>2. Redis: In-memory Caching, Session/JWT blacklist, Hash lưu bài thi trực tiếp, Sorted Set (ZSET) xếp hạng tuần.</w:t>
+              <w:t>2. Redis (Key-Value Store): In-Memory Cache siêu tốc, Blacklist JWT, Session thi trực tuyến với TTL, Real-time Leaderboard bằng Sorted Set, Sliding Window Rate Limiter.</w:t>
               <w:br/>
-              <w:t>3. Cassandra: Wide-column time-series lưu log học tập (learning_events), lịch sử vi phạm thi cử với cơ chế TTL.</w:t>
+              <w:t>3. Apache Cassandra (Column-family Store): Lưu trữ chuỗi thời gian ghi tải cực cao (learning_events, violation_logs) với chiến lược nén TWCS và tự động xóa bằng TTL.</w:t>
               <w:br/>
-              <w:t>4. Neo4j: Graph Database biểu diễn Skill Graph, lộ trình bài học (REQUIRES), gợi ý bạn cùng tiến (ENROLLED_IN).</w:t>
+              <w:t>4. Neo4j (Graph Database): Biểu diễn Đồ thị kỹ năng (Skill Graph), Mạng lưới lộ trình bài học (REQUIRES), và Thuật toán gợi ý bạn cùng tiến (ENROLLED_IN).</w:t>
             </w:r>
           </w:p>
         </w:tc>
@@ -2842,81 +3652,33 @@
               <w:right w:w="70" w:type="dxa"/>
             </w:tcMar>
             <w:vAlign w:val="center"/>
+            <w:tcMar>
+              <w:top w:w="80" w:type="dxa"/>
+              <w:bottom w:w="80" w:type="dxa"/>
+              <w:left w:w="100" w:type="dxa"/>
+              <w:right w:w="100" w:type="dxa"/>
+            </w:tcMar>
+            <w:tcBorders>
+              <w:top w:val="single" w:sz="4" w:space="0" w:color="000000"/>
+              <w:left w:val="single" w:sz="4" w:space="0" w:color="000000"/>
+              <w:bottom w:val="single" w:sz="4" w:space="0" w:color="000000"/>
+              <w:right w:val="single" w:sz="4" w:space="0" w:color="000000"/>
+            </w:tcBorders>
           </w:tcPr>
           <w:p>
             <w:pPr>
-              <w:rPr>
-                <w:rFonts w:ascii="Times New Roman" w:hAnsi="Times New Roman" w:cs="Times New Roman"/>
-                <w:sz w:val="26"/>
-                <w:szCs w:val="26"/>
-              </w:rPr>
+              <w:spacing w:line="312" w:lineRule="auto" w:before="40" w:after="40"/>
+              <w:ind w:firstLine="0"/>
+              <w:jc w:val="left"/>
             </w:pPr>
             <w:r>
               <w:rPr>
-                <w:rFonts w:ascii="Times New Roman" w:eastAsia="Arial" w:hAnsi="Times New Roman" w:cs="Times New Roman"/>
+                <w:rFonts w:ascii="Times New Roman" w:hAnsi="Times New Roman"/>
                 <w:b/>
-                <w:sz w:val="26"/>
-                <w:szCs w:val="26"/>
+                <w:color w:val="000000"/>
+                <w:sz w:val="24"/>
               </w:rPr>
-              <w:t>Các</w:t>
-            </w:r>
-            <w:r>
-              <w:rPr>
-                <w:rFonts w:ascii="Times New Roman" w:eastAsia="Arial" w:hAnsi="Times New Roman" w:cs="Times New Roman"/>
-                <w:b/>
-                <w:sz w:val="26"/>
-                <w:szCs w:val="26"/>
-              </w:rPr>
-              <w:t xml:space="preserve"> </w:t>
-            </w:r>
-            <w:proofErr w:type="spellStart"/>
-            <w:r>
-              <w:rPr>
-                <w:rFonts w:ascii="Times New Roman" w:eastAsia="Arial" w:hAnsi="Times New Roman" w:cs="Times New Roman"/>
-                <w:b/>
-                <w:sz w:val="26"/>
-                <w:szCs w:val="26"/>
-              </w:rPr>
-              <w:t>sơ</w:t>
-            </w:r>
-            <w:proofErr w:type="spellEnd"/>
-            <w:r>
-              <w:rPr>
-                <w:rFonts w:ascii="Times New Roman" w:eastAsia="Arial" w:hAnsi="Times New Roman" w:cs="Times New Roman"/>
-                <w:b/>
-                <w:sz w:val="26"/>
-                <w:szCs w:val="26"/>
-              </w:rPr>
-              <w:t xml:space="preserve"> </w:t>
-            </w:r>
-            <w:proofErr w:type="spellStart"/>
-            <w:r>
-              <w:rPr>
-                <w:rFonts w:ascii="Times New Roman" w:eastAsia="Arial" w:hAnsi="Times New Roman" w:cs="Times New Roman"/>
-                <w:b/>
-                <w:sz w:val="26"/>
-                <w:szCs w:val="26"/>
-              </w:rPr>
-              <w:t>đồ</w:t>
-            </w:r>
-            <w:proofErr w:type="spellEnd"/>
-            <w:r>
-              <w:rPr>
-                <w:rFonts w:ascii="Times New Roman" w:eastAsia="Arial" w:hAnsi="Times New Roman" w:cs="Times New Roman"/>
-                <w:b/>
-                <w:sz w:val="26"/>
-                <w:szCs w:val="26"/>
-              </w:rPr>
-              <w:t xml:space="preserve"> </w:t>
-            </w:r>
-            <w:r>
-              <w:rPr>
-                <w:rFonts w:ascii="Times New Roman" w:eastAsia="Arial" w:hAnsi="Times New Roman" w:cs="Times New Roman"/>
-                <w:b/>
-                <w:sz w:val="26"/>
-                <w:szCs w:val="26"/>
-              </w:rPr>
-              <w:t>Database:</w:t>
+              <w:t>Các sơ đồ Database:</w:t>
             </w:r>
           </w:p>
         </w:tc>
@@ -2931,20 +3693,43 @@
               <w:right w:w="70" w:type="dxa"/>
             </w:tcMar>
             <w:vAlign w:val="center"/>
+            <w:tcMar>
+              <w:top w:w="80" w:type="dxa"/>
+              <w:bottom w:w="80" w:type="dxa"/>
+              <w:left w:w="100" w:type="dxa"/>
+              <w:right w:w="100" w:type="dxa"/>
+            </w:tcMar>
+            <w:tcBorders>
+              <w:top w:val="single" w:sz="4" w:space="0" w:color="000000"/>
+              <w:left w:val="single" w:sz="4" w:space="0" w:color="000000"/>
+              <w:bottom w:val="single" w:sz="4" w:space="0" w:color="000000"/>
+              <w:right w:val="single" w:sz="4" w:space="0" w:color="000000"/>
+            </w:tcBorders>
           </w:tcPr>
           <w:p>
+            <w:pPr>
+              <w:spacing w:line="312" w:lineRule="auto" w:before="40" w:after="40"/>
+              <w:ind w:firstLine="0"/>
+              <w:jc w:val="left"/>
+            </w:pPr>
             <w:r>
-              <w:t>• Kiến trúc tổng thể Polyglot Persistence NoSQL Architecture</w:t>
+              <w:rPr>
+                <w:rFonts w:ascii="Times New Roman" w:hAnsi="Times New Roman"/>
+                <w:b w:val="0"/>
+                <w:color w:val="000000"/>
+                <w:sz w:val="22"/>
+              </w:rPr>
+              <w:t>• Sơ đồ kiến trúc tổng thể Polyglot Persistence NoSQL Architecture</w:t>
               <w:br/>
-              <w:t>• Sơ đồ Document Data Model (MongoDB)</w:t>
+              <w:t>• Sơ đồ Document Data Model &amp; Index ESR trên MongoDB</w:t>
               <w:br/>
-              <w:t>• Sơ đồ Key-Value / In-Memory Structures (Redis)</w:t>
+              <w:t>• Sơ đồ Key-Value &amp; In-Memory Data Structures trên Redis</w:t>
               <w:br/>
-              <w:t>• Sơ đồ Column Family / Partition Key (Cassandra CQL)</w:t>
+              <w:t>• Sơ đồ Chebotko Column-family trên Apache Cassandra CQL</w:t>
               <w:br/>
-              <w:t>• Sơ đồ Property Graph Nodes &amp; Relationships (Neo4j Cypher)</w:t>
+              <w:t>• Sơ đồ Labeled Property Graph (Nodes &amp; Relationships) trên Neo4j Cypher</w:t>
               <w:br/>
-              <w:t>(Chi tiết đầy đủ trong tài liệu Nhom_18_GiaiDoan2_Database_Model.docx)</w:t>
+              <w:t>(Được trình bày và đặc tả chi tiết tại Chương 4 trong quyển báo cáo toàn văn)</w:t>
             </w:r>
           </w:p>
         </w:tc>
@@ -2952,7 +3737,8 @@
     </w:tbl>
     <w:p>
       <w:pPr>
-        <w:spacing w:after="20"/>
+        <w:spacing w:after="20" w:line="312" w:lineRule="auto"/>
+        <w:ind w:firstLine="0"/>
         <w:rPr>
           <w:rFonts w:ascii="Times New Roman" w:hAnsi="Times New Roman" w:cs="Times New Roman"/>
           <w:sz w:val="26"/>
@@ -2962,6 +3748,8 @@
     </w:p>
     <w:p>
       <w:pPr>
+        <w:spacing w:line="312" w:lineRule="auto"/>
+        <w:ind w:firstLine="0"/>
         <w:rPr>
           <w:rFonts w:ascii="Times New Roman" w:hAnsi="Times New Roman" w:cs="Times New Roman"/>
           <w:sz w:val="26"/>
@@ -2971,6 +3759,7 @@
       <w:r>
         <w:rPr>
           <w:rFonts w:ascii="Times New Roman" w:hAnsi="Times New Roman" w:cs="Times New Roman"/>
+          <w:color w:val="000000"/>
           <w:sz w:val="26"/>
           <w:szCs w:val="26"/>
         </w:rPr>
@@ -2981,7 +3770,7 @@
       <w:headerReference w:type="default" r:id="rId8"/>
       <w:footerReference w:type="default" r:id="rId9"/>
       <w:pgSz w:w="15840" w:h="12240" w:orient="landscape"/>
-      <w:pgMar w:top="850" w:right="850" w:bottom="794" w:left="850" w:header="397" w:footer="397" w:gutter="0"/>
+      <w:pgMar w:top="1417" w:right="1417" w:bottom="1417" w:left="1984" w:header="397" w:footer="397" w:gutter="0"/>
       <w:cols w:space="720"/>
       <w:docGrid w:linePitch="360"/>
     </w:sectPr>

</xml_diff>